<commit_message>
ajout prénom dans le titre
</commit_message>
<xml_diff>
--- a/LePetitCafe.docx
+++ b/LePetitCafe.docx
@@ -947,6 +947,9 @@
         <w:jc w:val="center"/>
       </w:pPr>
       <w:r>
+        <w:rPr>
+          <w:noProof/>
+        </w:rPr>
         <w:drawing>
           <wp:inline distT="0" distB="0" distL="0" distR="0" wp14:anchorId="70D9ABFE" wp14:editId="69A827D5">
             <wp:extent cx="2270760" cy="914017"/>
@@ -1270,6 +1273,9 @@
       <w:r>
         <w:t>inscrire dans l'historique de Git</w:t>
       </w:r>
+      <w:r>
+        <w:t xml:space="preserve"> (fichiers index.html et style.css sur pronote)</w:t>
+      </w:r>
     </w:p>
     <w:p>
       <w:pPr>
@@ -1411,10 +1417,7 @@
         <w:t xml:space="preserve"> </w:t>
       </w:r>
       <w:r>
-        <w:t>r</w:t>
-      </w:r>
-      <w:r>
-        <w:t>elier le projet local à GitHub</w:t>
+        <w:t>relier le projet local à GitHub</w:t>
       </w:r>
     </w:p>
     <w:p/>
@@ -1446,6 +1449,7 @@
       </w:pPr>
       <w:r>
         <w:rPr>
+          <w:noProof/>
           <w:bdr w:val="single" w:sz="4" w:space="0" w:color="auto" w:shadow="1"/>
         </w:rPr>
         <w:drawing>
@@ -1504,6 +1508,7 @@
       </w:pPr>
       <w:r>
         <w:rPr>
+          <w:noProof/>
           <w:bdr w:val="single" w:sz="4" w:space="0" w:color="auto" w:shadow="1"/>
         </w:rPr>
         <w:drawing>
@@ -1557,10 +1562,7 @@
         <w:pStyle w:val="Exercice"/>
       </w:pPr>
       <w:r>
-        <w:t xml:space="preserve">A. </w:t>
-      </w:r>
-      <w:r>
-        <w:t>Relier le repository local à GitHub</w:t>
+        <w:t>A. Relier le repository local à GitHub</w:t>
       </w:r>
     </w:p>
     <w:p/>
@@ -1597,6 +1599,9 @@
         <w:pStyle w:val="Paragraphedeliste"/>
       </w:pPr>
       <w:r>
+        <w:rPr>
+          <w:noProof/>
+        </w:rPr>
         <w:drawing>
           <wp:inline distT="0" distB="0" distL="0" distR="0" wp14:anchorId="7B922F40" wp14:editId="366045F7">
             <wp:extent cx="5760720" cy="361346"/>
@@ -1657,9 +1662,731 @@
       </w:r>
     </w:p>
     <w:p>
+      <w:pPr>
+        <w:autoSpaceDE w:val="0"/>
+        <w:autoSpaceDN w:val="0"/>
+        <w:adjustRightInd w:val="0"/>
+        <w:contextualSpacing w:val="0"/>
+        <w:jc w:val="left"/>
+        <w:rPr>
+          <w:rFonts w:ascii="Lucida Console" w:hAnsi="Lucida Console" w:cs="Lucida Console"/>
+          <w:sz w:val="18"/>
+          <w:szCs w:val="18"/>
+          <w:lang w:eastAsia="en-US"/>
+        </w:rPr>
+      </w:pPr>
+      <w:r>
+        <w:rPr>
+          <w:rFonts w:ascii="Lucida Console" w:hAnsi="Lucida Console" w:cs="Lucida Console"/>
+          <w:sz w:val="18"/>
+          <w:szCs w:val="18"/>
+          <w:lang w:eastAsia="en-US"/>
+        </w:rPr>
+        <w:t>$ git remote -v</w:t>
+      </w:r>
+    </w:p>
+    <w:p>
+      <w:pPr>
+        <w:autoSpaceDE w:val="0"/>
+        <w:autoSpaceDN w:val="0"/>
+        <w:adjustRightInd w:val="0"/>
+        <w:contextualSpacing w:val="0"/>
+        <w:jc w:val="left"/>
+        <w:rPr>
+          <w:rFonts w:ascii="Lucida Console" w:hAnsi="Lucida Console" w:cs="Lucida Console"/>
+          <w:sz w:val="18"/>
+          <w:szCs w:val="18"/>
+          <w:lang w:eastAsia="en-US"/>
+        </w:rPr>
+      </w:pPr>
+      <w:r>
+        <w:rPr>
+          <w:rFonts w:ascii="Lucida Console" w:hAnsi="Lucida Console" w:cs="Lucida Console"/>
+          <w:sz w:val="18"/>
+          <w:szCs w:val="18"/>
+          <w:lang w:eastAsia="en-US"/>
+        </w:rPr>
+        <w:t>origin  https://github.com/corinneac-nice/petitCafe.git (fetch)</w:t>
+      </w:r>
+    </w:p>
+    <w:p>
+      <w:pPr>
+        <w:autoSpaceDE w:val="0"/>
+        <w:autoSpaceDN w:val="0"/>
+        <w:adjustRightInd w:val="0"/>
+        <w:contextualSpacing w:val="0"/>
+        <w:jc w:val="left"/>
+        <w:rPr>
+          <w:rFonts w:ascii="Lucida Console" w:hAnsi="Lucida Console" w:cs="Lucida Console"/>
+          <w:sz w:val="18"/>
+          <w:szCs w:val="18"/>
+          <w:lang w:eastAsia="en-US"/>
+        </w:rPr>
+      </w:pPr>
+      <w:r>
+        <w:rPr>
+          <w:rFonts w:ascii="Lucida Console" w:hAnsi="Lucida Console" w:cs="Lucida Console"/>
+          <w:sz w:val="18"/>
+          <w:szCs w:val="18"/>
+          <w:lang w:eastAsia="en-US"/>
+        </w:rPr>
+        <w:t>origin  https://github.com/corinneac-nice/petitCafe.git (push)</w:t>
+      </w:r>
+    </w:p>
+    <w:p/>
+    <w:p>
+      <w:pPr>
+        <w:pStyle w:val="Exercice"/>
+      </w:pPr>
+      <w:r>
+        <w:t xml:space="preserve">A. </w:t>
+      </w:r>
+      <w:r>
+        <w:t>Pousser le projet sur GitHub</w:t>
+      </w:r>
+    </w:p>
+    <w:p/>
+    <w:p>
+      <w:pPr>
+        <w:spacing w:before="100" w:beforeAutospacing="1" w:after="100" w:afterAutospacing="1"/>
+        <w:contextualSpacing w:val="0"/>
+        <w:jc w:val="left"/>
+      </w:pPr>
+      <w:r>
+        <w:t>Renommer la branche principale en main (elle s'appelle master pour l'instant. Historiquement, la branche principale s'appelait souvent master. Aujourd'hui, main est devenue le nom standard utilisé par beaucoup de projets.):</w:t>
+      </w:r>
+    </w:p>
+    <w:p>
+      <w:pPr>
+        <w:autoSpaceDE w:val="0"/>
+        <w:autoSpaceDN w:val="0"/>
+        <w:adjustRightInd w:val="0"/>
+        <w:contextualSpacing w:val="0"/>
+        <w:jc w:val="left"/>
+        <w:rPr>
+          <w:rFonts w:ascii="Lucida Console" w:hAnsi="Lucida Console" w:cs="Lucida Console"/>
+          <w:color w:val="00A89A"/>
+          <w:sz w:val="18"/>
+          <w:szCs w:val="18"/>
+          <w:lang w:eastAsia="en-US"/>
+        </w:rPr>
+      </w:pPr>
+      <w:r>
+        <w:rPr>
+          <w:rFonts w:ascii="Lucida Console" w:hAnsi="Lucida Console" w:cs="Lucida Console"/>
+          <w:color w:val="1CA800"/>
+          <w:sz w:val="18"/>
+          <w:szCs w:val="18"/>
+          <w:lang w:eastAsia="en-US"/>
+        </w:rPr>
+        <w:t xml:space="preserve">Corinne@CORINNE-HP </w:t>
+      </w:r>
+      <w:r>
+        <w:rPr>
+          <w:rFonts w:ascii="Lucida Console" w:hAnsi="Lucida Console" w:cs="Lucida Console"/>
+          <w:color w:val="B148C6"/>
+          <w:sz w:val="18"/>
+          <w:szCs w:val="18"/>
+          <w:lang w:eastAsia="en-US"/>
+        </w:rPr>
+        <w:t xml:space="preserve">MINGW64 </w:t>
+      </w:r>
+      <w:r>
+        <w:rPr>
+          <w:rFonts w:ascii="Lucida Console" w:hAnsi="Lucida Console" w:cs="Lucida Console"/>
+          <w:color w:val="C0A000"/>
+          <w:sz w:val="18"/>
+          <w:szCs w:val="18"/>
+          <w:lang w:eastAsia="en-US"/>
+        </w:rPr>
+        <w:t>~/Dropbox/SIO/bloc2/_2026/petitCafe</w:t>
+      </w:r>
+      <w:r>
+        <w:rPr>
+          <w:rFonts w:ascii="Lucida Console" w:hAnsi="Lucida Console" w:cs="Lucida Console"/>
+          <w:color w:val="00A89A"/>
+          <w:sz w:val="18"/>
+          <w:szCs w:val="18"/>
+          <w:lang w:eastAsia="en-US"/>
+        </w:rPr>
+        <w:t xml:space="preserve"> </w:t>
+      </w:r>
+      <w:r>
+        <w:rPr>
+          <w:rFonts w:ascii="Lucida Console" w:hAnsi="Lucida Console" w:cs="Lucida Console"/>
+          <w:b/>
+          <w:color w:val="00A89A"/>
+          <w:sz w:val="18"/>
+          <w:szCs w:val="18"/>
+          <w:lang w:eastAsia="en-US"/>
+        </w:rPr>
+        <w:t>(master)</w:t>
+      </w:r>
+    </w:p>
+    <w:p>
+      <w:pPr>
+        <w:pStyle w:val="code"/>
+        <w:rPr>
+          <w:lang w:eastAsia="en-US"/>
+        </w:rPr>
+      </w:pPr>
+      <w:r>
+        <w:rPr>
+          <w:lang w:eastAsia="en-US"/>
+        </w:rPr>
+        <w:t>$ git branch -M main</w:t>
+      </w:r>
+    </w:p>
+    <w:p>
+      <w:pPr>
+        <w:autoSpaceDE w:val="0"/>
+        <w:autoSpaceDN w:val="0"/>
+        <w:adjustRightInd w:val="0"/>
+        <w:contextualSpacing w:val="0"/>
+        <w:jc w:val="left"/>
+        <w:rPr>
+          <w:rFonts w:ascii="Lucida Console" w:hAnsi="Lucida Console" w:cs="Lucida Console"/>
+          <w:sz w:val="18"/>
+          <w:szCs w:val="18"/>
+          <w:lang w:eastAsia="en-US"/>
+        </w:rPr>
+      </w:pPr>
+    </w:p>
+    <w:p>
+      <w:pPr>
+        <w:autoSpaceDE w:val="0"/>
+        <w:autoSpaceDN w:val="0"/>
+        <w:adjustRightInd w:val="0"/>
+        <w:contextualSpacing w:val="0"/>
+        <w:jc w:val="left"/>
+        <w:rPr>
+          <w:rFonts w:ascii="Lucida Console" w:hAnsi="Lucida Console" w:cs="Lucida Console"/>
+          <w:color w:val="00A89A"/>
+          <w:sz w:val="18"/>
+          <w:szCs w:val="18"/>
+          <w:lang w:eastAsia="en-US"/>
+        </w:rPr>
+      </w:pPr>
+      <w:r>
+        <w:rPr>
+          <w:rFonts w:ascii="Lucida Console" w:hAnsi="Lucida Console" w:cs="Lucida Console"/>
+          <w:color w:val="1CA800"/>
+          <w:sz w:val="18"/>
+          <w:szCs w:val="18"/>
+          <w:lang w:eastAsia="en-US"/>
+        </w:rPr>
+        <w:t xml:space="preserve">Corinne@CORINNE-HP </w:t>
+      </w:r>
+      <w:r>
+        <w:rPr>
+          <w:rFonts w:ascii="Lucida Console" w:hAnsi="Lucida Console" w:cs="Lucida Console"/>
+          <w:color w:val="B148C6"/>
+          <w:sz w:val="18"/>
+          <w:szCs w:val="18"/>
+          <w:lang w:eastAsia="en-US"/>
+        </w:rPr>
+        <w:t xml:space="preserve">MINGW64 </w:t>
+      </w:r>
+      <w:r>
+        <w:rPr>
+          <w:rFonts w:ascii="Lucida Console" w:hAnsi="Lucida Console" w:cs="Lucida Console"/>
+          <w:color w:val="C0A000"/>
+          <w:sz w:val="18"/>
+          <w:szCs w:val="18"/>
+          <w:lang w:eastAsia="en-US"/>
+        </w:rPr>
+        <w:t>~/Dropbox/SIO/bloc2/_2026/petitCafe</w:t>
+      </w:r>
+      <w:r>
+        <w:rPr>
+          <w:rFonts w:ascii="Lucida Console" w:hAnsi="Lucida Console" w:cs="Lucida Console"/>
+          <w:color w:val="00A89A"/>
+          <w:sz w:val="18"/>
+          <w:szCs w:val="18"/>
+          <w:lang w:eastAsia="en-US"/>
+        </w:rPr>
+        <w:t xml:space="preserve"> </w:t>
+      </w:r>
+      <w:r>
+        <w:rPr>
+          <w:rFonts w:ascii="Lucida Console" w:hAnsi="Lucida Console" w:cs="Lucida Console"/>
+          <w:b/>
+          <w:color w:val="00A89A"/>
+          <w:sz w:val="18"/>
+          <w:szCs w:val="18"/>
+          <w:lang w:eastAsia="en-US"/>
+        </w:rPr>
+        <w:t>(main)</w:t>
+      </w:r>
+    </w:p>
+    <w:p>
+      <w:pPr>
+        <w:spacing w:before="100" w:beforeAutospacing="1" w:after="100" w:afterAutospacing="1"/>
+        <w:contextualSpacing w:val="0"/>
+        <w:jc w:val="left"/>
+        <w:rPr>
+          <w:rFonts w:ascii="Times New Roman" w:hAnsi="Times New Roman" w:cs="Times New Roman"/>
+          <w:sz w:val="24"/>
+          <w:szCs w:val="24"/>
+        </w:rPr>
+      </w:pPr>
+      <w:r>
+        <w:rPr>
+          <w:rFonts w:ascii="Times New Roman" w:hAnsi="Times New Roman" w:cs="Times New Roman"/>
+          <w:sz w:val="24"/>
+          <w:szCs w:val="24"/>
+        </w:rPr>
+        <w:t>E</w:t>
+      </w:r>
+      <w:r>
+        <w:rPr>
+          <w:rFonts w:ascii="Times New Roman" w:hAnsi="Times New Roman" w:cs="Times New Roman"/>
+          <w:sz w:val="24"/>
+          <w:szCs w:val="24"/>
+        </w:rPr>
+        <w:t>nvoyer le commit sur GitHub :</w:t>
+      </w:r>
+    </w:p>
+    <w:p>
+      <w:pPr>
+        <w:pStyle w:val="code"/>
+      </w:pPr>
+      <w:r>
+        <w:t>git push -u origin main</w:t>
+      </w:r>
+    </w:p>
+    <w:p/>
+    <w:p>
+      <w:r>
+        <w:t xml:space="preserve">Saisir le nom de votre compte sur github et le personnal access token (PAT) </w:t>
+      </w:r>
+    </w:p>
+    <w:p/>
+    <w:p>
+      <w:r>
+        <w:t>P</w:t>
+      </w:r>
+      <w:r>
+        <w:t xml:space="preserve">our générer ce token si vous ne l'avez pas. </w:t>
+      </w:r>
+    </w:p>
+    <w:p>
+      <w:r>
+        <w:t xml:space="preserve">Photo de profil </w:t>
+      </w:r>
+      <w:r>
+        <w:sym w:font="Wingdings" w:char="F0E0"/>
+      </w:r>
+      <w:r>
+        <w:t xml:space="preserve"> Settings </w:t>
+      </w:r>
+      <w:r>
+        <w:sym w:font="Wingdings" w:char="F0E0"/>
+      </w:r>
+      <w:r>
+        <w:t xml:space="preserve">Developer settings </w:t>
+      </w:r>
+      <w:r>
+        <w:sym w:font="Wingdings" w:char="F0E0"/>
+      </w:r>
+      <w:r>
+        <w:t xml:space="preserve">Personal access tokens </w:t>
+      </w:r>
+      <w:r>
+        <w:sym w:font="Wingdings" w:char="F0E0"/>
+      </w:r>
+      <w:r>
+        <w:t xml:space="preserve">Fine-grained tokens </w:t>
+      </w:r>
+      <w:r>
+        <w:sym w:font="Wingdings" w:char="F0E0"/>
+      </w:r>
+      <w:r>
+        <w:t>Generate new token</w:t>
+      </w:r>
+    </w:p>
+    <w:p>
+      <w:r>
+        <w:t>Attention, copiez le quelque part)</w:t>
+      </w:r>
+    </w:p>
+    <w:p>
+      <w:pPr>
+        <w:spacing w:before="100" w:beforeAutospacing="1" w:after="100" w:afterAutospacing="1"/>
+        <w:contextualSpacing w:val="0"/>
+        <w:jc w:val="left"/>
+        <w:rPr>
+          <w:rFonts w:ascii="Lucida Console" w:hAnsi="Lucida Console" w:cs="Lucida Console"/>
+          <w:sz w:val="18"/>
+          <w:szCs w:val="18"/>
+          <w:lang w:eastAsia="en-US"/>
+        </w:rPr>
+      </w:pPr>
+      <w:r>
+        <w:rPr>
+          <w:rFonts w:ascii="Times New Roman" w:hAnsi="Times New Roman" w:cs="Times New Roman"/>
+          <w:sz w:val="24"/>
+          <w:szCs w:val="24"/>
+        </w:rPr>
+        <w:t xml:space="preserve">Le projet </w:t>
+      </w:r>
+      <w:r>
+        <w:rPr>
+          <w:rFonts w:ascii="Times New Roman" w:hAnsi="Times New Roman" w:cs="Times New Roman"/>
+          <w:sz w:val="24"/>
+          <w:szCs w:val="24"/>
+        </w:rPr>
+        <w:t>devrait</w:t>
+      </w:r>
+      <w:r>
+        <w:rPr>
+          <w:rFonts w:ascii="Times New Roman" w:hAnsi="Times New Roman" w:cs="Times New Roman"/>
+          <w:sz w:val="24"/>
+          <w:szCs w:val="24"/>
+        </w:rPr>
+        <w:t xml:space="preserve"> maintenant </w:t>
+      </w:r>
+      <w:r>
+        <w:rPr>
+          <w:rFonts w:ascii="Times New Roman" w:hAnsi="Times New Roman" w:cs="Times New Roman"/>
+          <w:sz w:val="24"/>
+          <w:szCs w:val="24"/>
+        </w:rPr>
+        <w:t xml:space="preserve">être </w:t>
+      </w:r>
+      <w:r>
+        <w:rPr>
+          <w:rFonts w:ascii="Times New Roman" w:hAnsi="Times New Roman" w:cs="Times New Roman"/>
+          <w:sz w:val="24"/>
+          <w:szCs w:val="24"/>
+        </w:rPr>
+        <w:t>disponible sur GitHub.</w:t>
+      </w:r>
+      <w:r>
+        <w:rPr>
+          <w:rFonts w:ascii="Times New Roman" w:hAnsi="Times New Roman" w:cs="Times New Roman"/>
+          <w:sz w:val="24"/>
+          <w:szCs w:val="24"/>
+        </w:rPr>
+        <w:t xml:space="preserve"> MAIS si problème comme j'ai rencontré : </w:t>
+      </w:r>
+    </w:p>
+    <w:p>
+      <w:pPr>
+        <w:spacing w:before="100" w:beforeAutospacing="1" w:after="100" w:afterAutospacing="1"/>
+        <w:contextualSpacing w:val="0"/>
+        <w:jc w:val="left"/>
+        <w:rPr>
+          <w:rFonts w:ascii="Lucida Console" w:hAnsi="Lucida Console" w:cs="Lucida Console"/>
+          <w:sz w:val="18"/>
+          <w:szCs w:val="18"/>
+          <w:lang w:eastAsia="en-US"/>
+        </w:rPr>
+      </w:pPr>
+      <w:r>
+        <w:rPr>
+          <w:rFonts w:ascii="Lucida Console" w:hAnsi="Lucida Console" w:cs="Lucida Console"/>
+          <w:sz w:val="18"/>
+          <w:szCs w:val="18"/>
+          <w:lang w:eastAsia="en-US"/>
+        </w:rPr>
+        <w:t>$ git push -u origin main</w:t>
+      </w:r>
+    </w:p>
+    <w:p>
+      <w:pPr>
+        <w:autoSpaceDE w:val="0"/>
+        <w:autoSpaceDN w:val="0"/>
+        <w:adjustRightInd w:val="0"/>
+        <w:contextualSpacing w:val="0"/>
+        <w:jc w:val="left"/>
+        <w:rPr>
+          <w:rFonts w:ascii="Lucida Console" w:hAnsi="Lucida Console" w:cs="Lucida Console"/>
+          <w:sz w:val="18"/>
+          <w:szCs w:val="18"/>
+          <w:lang w:eastAsia="en-US"/>
+        </w:rPr>
+      </w:pPr>
+      <w:r>
+        <w:rPr>
+          <w:rFonts w:ascii="Lucida Console" w:hAnsi="Lucida Console" w:cs="Lucida Console"/>
+          <w:sz w:val="18"/>
+          <w:szCs w:val="18"/>
+          <w:lang w:eastAsia="en-US"/>
+        </w:rPr>
+        <w:t>git: 'credential-manager-core' is not a git command. See 'git --help'.</w:t>
+      </w:r>
+    </w:p>
+    <w:p>
+      <w:pPr>
+        <w:autoSpaceDE w:val="0"/>
+        <w:autoSpaceDN w:val="0"/>
+        <w:adjustRightInd w:val="0"/>
+        <w:contextualSpacing w:val="0"/>
+        <w:jc w:val="left"/>
+        <w:rPr>
+          <w:rFonts w:ascii="Lucida Console" w:hAnsi="Lucida Console" w:cs="Lucida Console"/>
+          <w:sz w:val="18"/>
+          <w:szCs w:val="18"/>
+          <w:lang w:eastAsia="en-US"/>
+        </w:rPr>
+      </w:pPr>
+      <w:r>
+        <w:rPr>
+          <w:rFonts w:ascii="Lucida Console" w:hAnsi="Lucida Console" w:cs="Lucida Console"/>
+          <w:sz w:val="18"/>
+          <w:szCs w:val="18"/>
+          <w:lang w:eastAsia="en-US"/>
+        </w:rPr>
+        <w:t>git: 'credential-manager-core' is not a git command. See 'git --help'.</w:t>
+      </w:r>
+    </w:p>
+    <w:p>
+      <w:pPr>
+        <w:autoSpaceDE w:val="0"/>
+        <w:autoSpaceDN w:val="0"/>
+        <w:adjustRightInd w:val="0"/>
+        <w:contextualSpacing w:val="0"/>
+        <w:jc w:val="left"/>
+        <w:rPr>
+          <w:rFonts w:ascii="Lucida Console" w:hAnsi="Lucida Console" w:cs="Lucida Console"/>
+          <w:sz w:val="18"/>
+          <w:szCs w:val="18"/>
+          <w:lang w:eastAsia="en-US"/>
+        </w:rPr>
+      </w:pPr>
+      <w:r>
+        <w:rPr>
+          <w:rFonts w:ascii="Lucida Console" w:hAnsi="Lucida Console" w:cs="Lucida Console"/>
+          <w:sz w:val="18"/>
+          <w:szCs w:val="18"/>
+          <w:lang w:eastAsia="en-US"/>
+        </w:rPr>
+        <w:t>remote: Invalid username or token. Password authentication is not supported for Git operations.</w:t>
+      </w:r>
+    </w:p>
+    <w:p>
+      <w:pPr>
+        <w:autoSpaceDE w:val="0"/>
+        <w:autoSpaceDN w:val="0"/>
+        <w:adjustRightInd w:val="0"/>
+        <w:contextualSpacing w:val="0"/>
+        <w:jc w:val="left"/>
+        <w:rPr>
+          <w:rFonts w:ascii="Lucida Console" w:hAnsi="Lucida Console" w:cs="Lucida Console"/>
+          <w:sz w:val="18"/>
+          <w:szCs w:val="18"/>
+          <w:lang w:eastAsia="en-US"/>
+        </w:rPr>
+      </w:pPr>
+      <w:r>
+        <w:rPr>
+          <w:rFonts w:ascii="Lucida Console" w:hAnsi="Lucida Console" w:cs="Lucida Console"/>
+          <w:color w:val="FF0000"/>
+          <w:sz w:val="18"/>
+          <w:szCs w:val="18"/>
+          <w:lang w:eastAsia="en-US"/>
+        </w:rPr>
+        <w:t>fatal</w:t>
+      </w:r>
+      <w:r>
+        <w:rPr>
+          <w:rFonts w:ascii="Lucida Console" w:hAnsi="Lucida Console" w:cs="Lucida Console"/>
+          <w:sz w:val="18"/>
+          <w:szCs w:val="18"/>
+          <w:lang w:eastAsia="en-US"/>
+        </w:rPr>
+        <w:t>: Authentication failed for 'https://github.com/corinneac-nice/petitCafe.git/'</w:t>
+      </w:r>
+    </w:p>
+    <w:p>
+      <w:pPr>
+        <w:autoSpaceDE w:val="0"/>
+        <w:autoSpaceDN w:val="0"/>
+        <w:adjustRightInd w:val="0"/>
+        <w:contextualSpacing w:val="0"/>
+        <w:jc w:val="left"/>
+        <w:rPr>
+          <w:rFonts w:ascii="Lucida Console" w:hAnsi="Lucida Console" w:cs="Lucida Console"/>
+          <w:sz w:val="18"/>
+          <w:szCs w:val="18"/>
+          <w:lang w:eastAsia="en-US"/>
+        </w:rPr>
+      </w:pPr>
+    </w:p>
+    <w:p>
+      <w:pPr>
+        <w:autoSpaceDE w:val="0"/>
+        <w:autoSpaceDN w:val="0"/>
+        <w:adjustRightInd w:val="0"/>
+        <w:contextualSpacing w:val="0"/>
+        <w:jc w:val="left"/>
+        <w:rPr>
+          <w:rFonts w:ascii="Lucida Console" w:hAnsi="Lucida Console" w:cs="Lucida Console"/>
+          <w:sz w:val="18"/>
+          <w:szCs w:val="18"/>
+          <w:lang w:eastAsia="en-US"/>
+        </w:rPr>
+      </w:pPr>
+      <w:r>
+        <w:rPr>
+          <w:rFonts w:ascii="Lucida Console" w:hAnsi="Lucida Console" w:cs="Lucida Console"/>
+          <w:sz w:val="18"/>
+          <w:szCs w:val="18"/>
+          <w:lang w:eastAsia="en-US"/>
+        </w:rPr>
+        <w:t>MODIFIER LE credential helper</w:t>
+      </w:r>
+    </w:p>
+    <w:p>
+      <w:pPr>
+        <w:autoSpaceDE w:val="0"/>
+        <w:autoSpaceDN w:val="0"/>
+        <w:adjustRightInd w:val="0"/>
+        <w:contextualSpacing w:val="0"/>
+        <w:jc w:val="left"/>
+        <w:rPr>
+          <w:rFonts w:ascii="Lucida Console" w:hAnsi="Lucida Console" w:cs="Lucida Console"/>
+          <w:color w:val="1CA800"/>
+          <w:sz w:val="18"/>
+          <w:szCs w:val="18"/>
+          <w:lang w:eastAsia="en-US"/>
+        </w:rPr>
+      </w:pPr>
+    </w:p>
+    <w:p>
+      <w:pPr>
+        <w:autoSpaceDE w:val="0"/>
+        <w:autoSpaceDN w:val="0"/>
+        <w:adjustRightInd w:val="0"/>
+        <w:contextualSpacing w:val="0"/>
+        <w:jc w:val="left"/>
+        <w:rPr>
+          <w:rFonts w:ascii="Lucida Console" w:hAnsi="Lucida Console" w:cs="Lucida Console"/>
+          <w:color w:val="00A89A"/>
+          <w:sz w:val="18"/>
+          <w:szCs w:val="18"/>
+          <w:lang w:eastAsia="en-US"/>
+        </w:rPr>
+      </w:pPr>
+      <w:r>
+        <w:rPr>
+          <w:rFonts w:ascii="Lucida Console" w:hAnsi="Lucida Console" w:cs="Lucida Console"/>
+          <w:color w:val="1CA800"/>
+          <w:sz w:val="18"/>
+          <w:szCs w:val="18"/>
+          <w:lang w:eastAsia="en-US"/>
+        </w:rPr>
+        <w:t xml:space="preserve">Corinne@CORINNE-HP </w:t>
+      </w:r>
+      <w:r>
+        <w:rPr>
+          <w:rFonts w:ascii="Lucida Console" w:hAnsi="Lucida Console" w:cs="Lucida Console"/>
+          <w:color w:val="B148C6"/>
+          <w:sz w:val="18"/>
+          <w:szCs w:val="18"/>
+          <w:lang w:eastAsia="en-US"/>
+        </w:rPr>
+        <w:t xml:space="preserve">MINGW64 </w:t>
+      </w:r>
+      <w:r>
+        <w:rPr>
+          <w:rFonts w:ascii="Lucida Console" w:hAnsi="Lucida Console" w:cs="Lucida Console"/>
+          <w:color w:val="C0A000"/>
+          <w:sz w:val="18"/>
+          <w:szCs w:val="18"/>
+          <w:lang w:eastAsia="en-US"/>
+        </w:rPr>
+        <w:t>~/Dropbox/SIO/bloc2/_2026/petitCafe</w:t>
+      </w:r>
+      <w:r>
+        <w:rPr>
+          <w:rFonts w:ascii="Lucida Console" w:hAnsi="Lucida Console" w:cs="Lucida Console"/>
+          <w:color w:val="00A89A"/>
+          <w:sz w:val="18"/>
+          <w:szCs w:val="18"/>
+          <w:lang w:eastAsia="en-US"/>
+        </w:rPr>
+        <w:t xml:space="preserve"> (main)</w:t>
+      </w:r>
+    </w:p>
+    <w:p>
+      <w:pPr>
+        <w:pStyle w:val="code"/>
+        <w:rPr>
+          <w:lang w:eastAsia="en-US"/>
+        </w:rPr>
+      </w:pPr>
+      <w:r>
+        <w:rPr>
+          <w:lang w:eastAsia="en-US"/>
+        </w:rPr>
+        <w:t>$ git config --global credential.helper manager</w:t>
+      </w:r>
+    </w:p>
+    <w:p>
+      <w:pPr>
+        <w:spacing w:before="100" w:beforeAutospacing="1" w:after="100" w:afterAutospacing="1"/>
+        <w:contextualSpacing w:val="0"/>
+        <w:jc w:val="left"/>
+      </w:pPr>
+      <w:r>
+        <w:t xml:space="preserve">Git Credential Manager va mémoriser </w:t>
+      </w:r>
+      <w:r>
+        <w:t>l'</w:t>
+      </w:r>
+      <w:r>
+        <w:t>authentification</w:t>
+      </w:r>
+      <w:r>
+        <w:t xml:space="preserve"> (l'id et le token)</w:t>
+      </w:r>
+      <w:r>
+        <w:t xml:space="preserve">, </w:t>
+      </w:r>
+      <w:r>
+        <w:t>et on</w:t>
+      </w:r>
+      <w:r>
+        <w:t xml:space="preserve"> ne devrai</w:t>
+      </w:r>
+      <w:r>
+        <w:t>t</w:t>
+      </w:r>
+      <w:r>
+        <w:t xml:space="preserve"> normalement pas avoir à </w:t>
+      </w:r>
+      <w:r>
+        <w:t>le res</w:t>
+      </w:r>
+      <w:r>
+        <w:t>saisir à chaque git push</w:t>
+      </w:r>
+    </w:p>
+    <w:p>
+      <w:pPr>
+        <w:spacing w:before="100" w:beforeAutospacing="1" w:after="100" w:afterAutospacing="1"/>
+        <w:contextualSpacing w:val="0"/>
+        <w:jc w:val="left"/>
+        <w:rPr>
+          <w:rFonts w:ascii="Times New Roman" w:hAnsi="Times New Roman" w:cs="Times New Roman"/>
+          <w:sz w:val="24"/>
+          <w:szCs w:val="24"/>
+        </w:rPr>
+      </w:pPr>
+      <w:r>
+        <w:rPr>
+          <w:rFonts w:ascii="Times New Roman" w:hAnsi="Times New Roman" w:cs="Times New Roman"/>
+          <w:sz w:val="24"/>
+          <w:szCs w:val="24"/>
+        </w:rPr>
+        <w:t xml:space="preserve">Relancer le push. </w:t>
+      </w:r>
       <w:bookmarkStart w:id="0" w:name="_GoBack"/>
       <w:bookmarkEnd w:id="0"/>
     </w:p>
+    <w:p/>
     <w:p>
       <w:pPr>
         <w:ind w:left="720"/>
@@ -1681,2433 +2408,6 @@
           <w:bar w:val="single" w:sz="4" w:color="auto"/>
         </w:pBdr>
         <w:rPr>
-          <w:sz w:val="28"/>
-          <w:szCs w:val="28"/>
-        </w:rPr>
-      </w:pPr>
-      <w:r>
-        <w:rPr>
-          <w:sz w:val="28"/>
-          <w:szCs w:val="28"/>
-        </w:rPr>
-        <w:t xml:space="preserve">Annexe 1 </w:t>
-      </w:r>
-      <w:r>
-        <w:rPr>
-          <w:sz w:val="28"/>
-          <w:szCs w:val="28"/>
-        </w:rPr>
-        <w:t xml:space="preserve">- </w:t>
-      </w:r>
-      <w:r>
-        <w:rPr>
-          <w:b/>
-          <w:sz w:val="28"/>
-          <w:szCs w:val="28"/>
-        </w:rPr>
-        <w:t xml:space="preserve">index.html </w:t>
-      </w:r>
-      <w:r>
-        <w:rPr>
-          <w:b/>
-          <w:sz w:val="28"/>
-          <w:szCs w:val="28"/>
-        </w:rPr>
-        <w:t>-</w:t>
-      </w:r>
-      <w:r>
-        <w:rPr>
-          <w:b/>
-          <w:sz w:val="28"/>
-          <w:szCs w:val="28"/>
-        </w:rPr>
-        <w:t xml:space="preserve"> Page d'accueil</w:t>
-      </w:r>
-    </w:p>
-    <w:p>
-      <w:pPr>
-        <w:tabs>
-          <w:tab w:val="left" w:pos="916"/>
-          <w:tab w:val="left" w:pos="1832"/>
-          <w:tab w:val="left" w:pos="2748"/>
-          <w:tab w:val="left" w:pos="3664"/>
-          <w:tab w:val="left" w:pos="4580"/>
-          <w:tab w:val="left" w:pos="5496"/>
-          <w:tab w:val="left" w:pos="6412"/>
-          <w:tab w:val="left" w:pos="7328"/>
-          <w:tab w:val="left" w:pos="8244"/>
-          <w:tab w:val="left" w:pos="9160"/>
-          <w:tab w:val="left" w:pos="10076"/>
-          <w:tab w:val="left" w:pos="10992"/>
-          <w:tab w:val="left" w:pos="11908"/>
-          <w:tab w:val="left" w:pos="12824"/>
-          <w:tab w:val="left" w:pos="13740"/>
-          <w:tab w:val="left" w:pos="14656"/>
-        </w:tabs>
-        <w:contextualSpacing w:val="0"/>
-        <w:jc w:val="left"/>
-        <w:rPr>
-          <w:rFonts w:ascii="Courier New" w:hAnsi="Courier New" w:cs="Courier New"/>
-          <w:sz w:val="20"/>
-        </w:rPr>
-      </w:pPr>
-    </w:p>
-    <w:p>
-      <w:pPr>
-        <w:tabs>
-          <w:tab w:val="left" w:pos="916"/>
-          <w:tab w:val="left" w:pos="1832"/>
-          <w:tab w:val="left" w:pos="2748"/>
-          <w:tab w:val="left" w:pos="3664"/>
-          <w:tab w:val="left" w:pos="4580"/>
-          <w:tab w:val="left" w:pos="5496"/>
-          <w:tab w:val="left" w:pos="6412"/>
-          <w:tab w:val="left" w:pos="7328"/>
-          <w:tab w:val="left" w:pos="8244"/>
-          <w:tab w:val="left" w:pos="9160"/>
-          <w:tab w:val="left" w:pos="10076"/>
-          <w:tab w:val="left" w:pos="10992"/>
-          <w:tab w:val="left" w:pos="11908"/>
-          <w:tab w:val="left" w:pos="12824"/>
-          <w:tab w:val="left" w:pos="13740"/>
-          <w:tab w:val="left" w:pos="14656"/>
-        </w:tabs>
-        <w:contextualSpacing w:val="0"/>
-        <w:jc w:val="left"/>
-      </w:pPr>
-      <w:r>
-        <w:t>&lt;section class="hero"&gt;</w:t>
-      </w:r>
-    </w:p>
-    <w:p>
-      <w:pPr>
-        <w:tabs>
-          <w:tab w:val="left" w:pos="916"/>
-          <w:tab w:val="left" w:pos="1832"/>
-          <w:tab w:val="left" w:pos="2748"/>
-          <w:tab w:val="left" w:pos="3664"/>
-          <w:tab w:val="left" w:pos="4580"/>
-          <w:tab w:val="left" w:pos="5496"/>
-          <w:tab w:val="left" w:pos="6412"/>
-          <w:tab w:val="left" w:pos="7328"/>
-          <w:tab w:val="left" w:pos="8244"/>
-          <w:tab w:val="left" w:pos="9160"/>
-          <w:tab w:val="left" w:pos="10076"/>
-          <w:tab w:val="left" w:pos="10992"/>
-          <w:tab w:val="left" w:pos="11908"/>
-          <w:tab w:val="left" w:pos="12824"/>
-          <w:tab w:val="left" w:pos="13740"/>
-          <w:tab w:val="left" w:pos="14656"/>
-        </w:tabs>
-        <w:contextualSpacing w:val="0"/>
-        <w:jc w:val="left"/>
-      </w:pPr>
-      <w:r>
-        <w:t xml:space="preserve">    &lt;h2&gt;Bienvenue au Petit Café&lt;/h2&gt;</w:t>
-      </w:r>
-    </w:p>
-    <w:p>
-      <w:pPr>
-        <w:tabs>
-          <w:tab w:val="left" w:pos="916"/>
-          <w:tab w:val="left" w:pos="1832"/>
-          <w:tab w:val="left" w:pos="2748"/>
-          <w:tab w:val="left" w:pos="3664"/>
-          <w:tab w:val="left" w:pos="4580"/>
-          <w:tab w:val="left" w:pos="5496"/>
-          <w:tab w:val="left" w:pos="6412"/>
-          <w:tab w:val="left" w:pos="7328"/>
-          <w:tab w:val="left" w:pos="8244"/>
-          <w:tab w:val="left" w:pos="9160"/>
-          <w:tab w:val="left" w:pos="10076"/>
-          <w:tab w:val="left" w:pos="10992"/>
-          <w:tab w:val="left" w:pos="11908"/>
-          <w:tab w:val="left" w:pos="12824"/>
-          <w:tab w:val="left" w:pos="13740"/>
-          <w:tab w:val="left" w:pos="14656"/>
-        </w:tabs>
-        <w:contextualSpacing w:val="0"/>
-        <w:jc w:val="left"/>
-      </w:pPr>
-      <w:r>
-        <w:t xml:space="preserve">    &lt;p&gt;</w:t>
-      </w:r>
-    </w:p>
-    <w:p>
-      <w:pPr>
-        <w:tabs>
-          <w:tab w:val="left" w:pos="916"/>
-          <w:tab w:val="left" w:pos="1832"/>
-          <w:tab w:val="left" w:pos="2748"/>
-          <w:tab w:val="left" w:pos="3664"/>
-          <w:tab w:val="left" w:pos="4580"/>
-          <w:tab w:val="left" w:pos="5496"/>
-          <w:tab w:val="left" w:pos="6412"/>
-          <w:tab w:val="left" w:pos="7328"/>
-          <w:tab w:val="left" w:pos="8244"/>
-          <w:tab w:val="left" w:pos="9160"/>
-          <w:tab w:val="left" w:pos="10076"/>
-          <w:tab w:val="left" w:pos="10992"/>
-          <w:tab w:val="left" w:pos="11908"/>
-          <w:tab w:val="left" w:pos="12824"/>
-          <w:tab w:val="left" w:pos="13740"/>
-          <w:tab w:val="left" w:pos="14656"/>
-        </w:tabs>
-        <w:contextualSpacing w:val="0"/>
-        <w:jc w:val="left"/>
-      </w:pPr>
-      <w:r>
-        <w:t xml:space="preserve">        Venez profiter d'un moment convivial autour</w:t>
-      </w:r>
-    </w:p>
-    <w:p>
-      <w:pPr>
-        <w:tabs>
-          <w:tab w:val="left" w:pos="916"/>
-          <w:tab w:val="left" w:pos="1832"/>
-          <w:tab w:val="left" w:pos="2748"/>
-          <w:tab w:val="left" w:pos="3664"/>
-          <w:tab w:val="left" w:pos="4580"/>
-          <w:tab w:val="left" w:pos="5496"/>
-          <w:tab w:val="left" w:pos="6412"/>
-          <w:tab w:val="left" w:pos="7328"/>
-          <w:tab w:val="left" w:pos="8244"/>
-          <w:tab w:val="left" w:pos="9160"/>
-          <w:tab w:val="left" w:pos="10076"/>
-          <w:tab w:val="left" w:pos="10992"/>
-          <w:tab w:val="left" w:pos="11908"/>
-          <w:tab w:val="left" w:pos="12824"/>
-          <w:tab w:val="left" w:pos="13740"/>
-          <w:tab w:val="left" w:pos="14656"/>
-        </w:tabs>
-        <w:contextualSpacing w:val="0"/>
-        <w:jc w:val="left"/>
-      </w:pPr>
-      <w:r>
-        <w:t xml:space="preserve">        d'un bon café et de produits faits maison.</w:t>
-      </w:r>
-    </w:p>
-    <w:p>
-      <w:pPr>
-        <w:tabs>
-          <w:tab w:val="left" w:pos="916"/>
-          <w:tab w:val="left" w:pos="1832"/>
-          <w:tab w:val="left" w:pos="2748"/>
-          <w:tab w:val="left" w:pos="3664"/>
-          <w:tab w:val="left" w:pos="4580"/>
-          <w:tab w:val="left" w:pos="5496"/>
-          <w:tab w:val="left" w:pos="6412"/>
-          <w:tab w:val="left" w:pos="7328"/>
-          <w:tab w:val="left" w:pos="8244"/>
-          <w:tab w:val="left" w:pos="9160"/>
-          <w:tab w:val="left" w:pos="10076"/>
-          <w:tab w:val="left" w:pos="10992"/>
-          <w:tab w:val="left" w:pos="11908"/>
-          <w:tab w:val="left" w:pos="12824"/>
-          <w:tab w:val="left" w:pos="13740"/>
-          <w:tab w:val="left" w:pos="14656"/>
-        </w:tabs>
-        <w:contextualSpacing w:val="0"/>
-        <w:jc w:val="left"/>
-      </w:pPr>
-      <w:r>
-        <w:t xml:space="preserve">    &lt;/p&gt;</w:t>
-      </w:r>
-    </w:p>
-    <w:p>
-      <w:pPr>
-        <w:tabs>
-          <w:tab w:val="left" w:pos="916"/>
-          <w:tab w:val="left" w:pos="1832"/>
-          <w:tab w:val="left" w:pos="2748"/>
-          <w:tab w:val="left" w:pos="3664"/>
-          <w:tab w:val="left" w:pos="4580"/>
-          <w:tab w:val="left" w:pos="5496"/>
-          <w:tab w:val="left" w:pos="6412"/>
-          <w:tab w:val="left" w:pos="7328"/>
-          <w:tab w:val="left" w:pos="8244"/>
-          <w:tab w:val="left" w:pos="9160"/>
-          <w:tab w:val="left" w:pos="10076"/>
-          <w:tab w:val="left" w:pos="10992"/>
-          <w:tab w:val="left" w:pos="11908"/>
-          <w:tab w:val="left" w:pos="12824"/>
-          <w:tab w:val="left" w:pos="13740"/>
-          <w:tab w:val="left" w:pos="14656"/>
-        </w:tabs>
-        <w:contextualSpacing w:val="0"/>
-        <w:jc w:val="left"/>
-      </w:pPr>
-      <w:r>
-        <w:t xml:space="preserve">    &lt;a class="button" href="menu.html"&gt;Découvrir le menu&lt;/a&gt;</w:t>
-      </w:r>
-    </w:p>
-    <w:p>
-      <w:pPr>
-        <w:tabs>
-          <w:tab w:val="left" w:pos="916"/>
-          <w:tab w:val="left" w:pos="1832"/>
-          <w:tab w:val="left" w:pos="2748"/>
-          <w:tab w:val="left" w:pos="3664"/>
-          <w:tab w:val="left" w:pos="4580"/>
-          <w:tab w:val="left" w:pos="5496"/>
-          <w:tab w:val="left" w:pos="6412"/>
-          <w:tab w:val="left" w:pos="7328"/>
-          <w:tab w:val="left" w:pos="8244"/>
-          <w:tab w:val="left" w:pos="9160"/>
-          <w:tab w:val="left" w:pos="10076"/>
-          <w:tab w:val="left" w:pos="10992"/>
-          <w:tab w:val="left" w:pos="11908"/>
-          <w:tab w:val="left" w:pos="12824"/>
-          <w:tab w:val="left" w:pos="13740"/>
-          <w:tab w:val="left" w:pos="14656"/>
-        </w:tabs>
-        <w:contextualSpacing w:val="0"/>
-        <w:jc w:val="left"/>
-      </w:pPr>
-      <w:r>
-        <w:t>&lt;/section&gt;</w:t>
-      </w:r>
-    </w:p>
-    <w:p>
-      <w:pPr>
-        <w:tabs>
-          <w:tab w:val="left" w:pos="916"/>
-          <w:tab w:val="left" w:pos="1832"/>
-          <w:tab w:val="left" w:pos="2748"/>
-          <w:tab w:val="left" w:pos="3664"/>
-          <w:tab w:val="left" w:pos="4580"/>
-          <w:tab w:val="left" w:pos="5496"/>
-          <w:tab w:val="left" w:pos="6412"/>
-          <w:tab w:val="left" w:pos="7328"/>
-          <w:tab w:val="left" w:pos="8244"/>
-          <w:tab w:val="left" w:pos="9160"/>
-          <w:tab w:val="left" w:pos="10076"/>
-          <w:tab w:val="left" w:pos="10992"/>
-          <w:tab w:val="left" w:pos="11908"/>
-          <w:tab w:val="left" w:pos="12824"/>
-          <w:tab w:val="left" w:pos="13740"/>
-          <w:tab w:val="left" w:pos="14656"/>
-        </w:tabs>
-        <w:contextualSpacing w:val="0"/>
-        <w:jc w:val="left"/>
-      </w:pPr>
-    </w:p>
-    <w:p>
-      <w:pPr>
-        <w:tabs>
-          <w:tab w:val="left" w:pos="916"/>
-          <w:tab w:val="left" w:pos="1832"/>
-          <w:tab w:val="left" w:pos="2748"/>
-          <w:tab w:val="left" w:pos="3664"/>
-          <w:tab w:val="left" w:pos="4580"/>
-          <w:tab w:val="left" w:pos="5496"/>
-          <w:tab w:val="left" w:pos="6412"/>
-          <w:tab w:val="left" w:pos="7328"/>
-          <w:tab w:val="left" w:pos="8244"/>
-          <w:tab w:val="left" w:pos="9160"/>
-          <w:tab w:val="left" w:pos="10076"/>
-          <w:tab w:val="left" w:pos="10992"/>
-          <w:tab w:val="left" w:pos="11908"/>
-          <w:tab w:val="left" w:pos="12824"/>
-          <w:tab w:val="left" w:pos="13740"/>
-          <w:tab w:val="left" w:pos="14656"/>
-        </w:tabs>
-        <w:contextualSpacing w:val="0"/>
-        <w:jc w:val="left"/>
-      </w:pPr>
-      <w:r>
-        <w:t>&lt;section&gt;</w:t>
-      </w:r>
-    </w:p>
-    <w:p>
-      <w:pPr>
-        <w:tabs>
-          <w:tab w:val="left" w:pos="916"/>
-          <w:tab w:val="left" w:pos="1832"/>
-          <w:tab w:val="left" w:pos="2748"/>
-          <w:tab w:val="left" w:pos="3664"/>
-          <w:tab w:val="left" w:pos="4580"/>
-          <w:tab w:val="left" w:pos="5496"/>
-          <w:tab w:val="left" w:pos="6412"/>
-          <w:tab w:val="left" w:pos="7328"/>
-          <w:tab w:val="left" w:pos="8244"/>
-          <w:tab w:val="left" w:pos="9160"/>
-          <w:tab w:val="left" w:pos="10076"/>
-          <w:tab w:val="left" w:pos="10992"/>
-          <w:tab w:val="left" w:pos="11908"/>
-          <w:tab w:val="left" w:pos="12824"/>
-          <w:tab w:val="left" w:pos="13740"/>
-          <w:tab w:val="left" w:pos="14656"/>
-        </w:tabs>
-        <w:contextualSpacing w:val="0"/>
-        <w:jc w:val="left"/>
-      </w:pPr>
-      <w:r>
-        <w:t xml:space="preserve">    &lt;h2&gt;Notre histoire&lt;/h2&gt;</w:t>
-      </w:r>
-    </w:p>
-    <w:p>
-      <w:pPr>
-        <w:tabs>
-          <w:tab w:val="left" w:pos="916"/>
-          <w:tab w:val="left" w:pos="1832"/>
-          <w:tab w:val="left" w:pos="2748"/>
-          <w:tab w:val="left" w:pos="3664"/>
-          <w:tab w:val="left" w:pos="4580"/>
-          <w:tab w:val="left" w:pos="5496"/>
-          <w:tab w:val="left" w:pos="6412"/>
-          <w:tab w:val="left" w:pos="7328"/>
-          <w:tab w:val="left" w:pos="8244"/>
-          <w:tab w:val="left" w:pos="9160"/>
-          <w:tab w:val="left" w:pos="10076"/>
-          <w:tab w:val="left" w:pos="10992"/>
-          <w:tab w:val="left" w:pos="11908"/>
-          <w:tab w:val="left" w:pos="12824"/>
-          <w:tab w:val="left" w:pos="13740"/>
-          <w:tab w:val="left" w:pos="14656"/>
-        </w:tabs>
-        <w:contextualSpacing w:val="0"/>
-        <w:jc w:val="left"/>
-      </w:pPr>
-      <w:r>
-        <w:t xml:space="preserve">    &lt;p&gt;</w:t>
-      </w:r>
-    </w:p>
-    <w:p>
-      <w:pPr>
-        <w:tabs>
-          <w:tab w:val="left" w:pos="916"/>
-          <w:tab w:val="left" w:pos="1832"/>
-          <w:tab w:val="left" w:pos="2748"/>
-          <w:tab w:val="left" w:pos="3664"/>
-          <w:tab w:val="left" w:pos="4580"/>
-          <w:tab w:val="left" w:pos="5496"/>
-          <w:tab w:val="left" w:pos="6412"/>
-          <w:tab w:val="left" w:pos="7328"/>
-          <w:tab w:val="left" w:pos="8244"/>
-          <w:tab w:val="left" w:pos="9160"/>
-          <w:tab w:val="left" w:pos="10076"/>
-          <w:tab w:val="left" w:pos="10992"/>
-          <w:tab w:val="left" w:pos="11908"/>
-          <w:tab w:val="left" w:pos="12824"/>
-          <w:tab w:val="left" w:pos="13740"/>
-          <w:tab w:val="left" w:pos="14656"/>
-        </w:tabs>
-        <w:contextualSpacing w:val="0"/>
-        <w:jc w:val="left"/>
-      </w:pPr>
-      <w:r>
-        <w:t xml:space="preserve">        Depuis 2020, Le Petit Café accueille les habitants</w:t>
-      </w:r>
-    </w:p>
-    <w:p>
-      <w:pPr>
-        <w:tabs>
-          <w:tab w:val="left" w:pos="916"/>
-          <w:tab w:val="left" w:pos="1832"/>
-          <w:tab w:val="left" w:pos="2748"/>
-          <w:tab w:val="left" w:pos="3664"/>
-          <w:tab w:val="left" w:pos="4580"/>
-          <w:tab w:val="left" w:pos="5496"/>
-          <w:tab w:val="left" w:pos="6412"/>
-          <w:tab w:val="left" w:pos="7328"/>
-          <w:tab w:val="left" w:pos="8244"/>
-          <w:tab w:val="left" w:pos="9160"/>
-          <w:tab w:val="left" w:pos="10076"/>
-          <w:tab w:val="left" w:pos="10992"/>
-          <w:tab w:val="left" w:pos="11908"/>
-          <w:tab w:val="left" w:pos="12824"/>
-          <w:tab w:val="left" w:pos="13740"/>
-          <w:tab w:val="left" w:pos="14656"/>
-        </w:tabs>
-        <w:contextualSpacing w:val="0"/>
-        <w:jc w:val="left"/>
-      </w:pPr>
-      <w:r>
-        <w:t xml:space="preserve">        du quartier dans une ambiance simple et chaleureuse.</w:t>
-      </w:r>
-    </w:p>
-    <w:p>
-      <w:pPr>
-        <w:tabs>
-          <w:tab w:val="left" w:pos="916"/>
-          <w:tab w:val="left" w:pos="1832"/>
-          <w:tab w:val="left" w:pos="2748"/>
-          <w:tab w:val="left" w:pos="3664"/>
-          <w:tab w:val="left" w:pos="4580"/>
-          <w:tab w:val="left" w:pos="5496"/>
-          <w:tab w:val="left" w:pos="6412"/>
-          <w:tab w:val="left" w:pos="7328"/>
-          <w:tab w:val="left" w:pos="8244"/>
-          <w:tab w:val="left" w:pos="9160"/>
-          <w:tab w:val="left" w:pos="10076"/>
-          <w:tab w:val="left" w:pos="10992"/>
-          <w:tab w:val="left" w:pos="11908"/>
-          <w:tab w:val="left" w:pos="12824"/>
-          <w:tab w:val="left" w:pos="13740"/>
-          <w:tab w:val="left" w:pos="14656"/>
-        </w:tabs>
-        <w:contextualSpacing w:val="0"/>
-        <w:jc w:val="left"/>
-      </w:pPr>
-      <w:r>
-        <w:t xml:space="preserve">    &lt;/p&gt;</w:t>
-      </w:r>
-    </w:p>
-    <w:p>
-      <w:pPr>
-        <w:tabs>
-          <w:tab w:val="left" w:pos="916"/>
-          <w:tab w:val="left" w:pos="1832"/>
-          <w:tab w:val="left" w:pos="2748"/>
-          <w:tab w:val="left" w:pos="3664"/>
-          <w:tab w:val="left" w:pos="4580"/>
-          <w:tab w:val="left" w:pos="5496"/>
-          <w:tab w:val="left" w:pos="6412"/>
-          <w:tab w:val="left" w:pos="7328"/>
-          <w:tab w:val="left" w:pos="8244"/>
-          <w:tab w:val="left" w:pos="9160"/>
-          <w:tab w:val="left" w:pos="10076"/>
-          <w:tab w:val="left" w:pos="10992"/>
-          <w:tab w:val="left" w:pos="11908"/>
-          <w:tab w:val="left" w:pos="12824"/>
-          <w:tab w:val="left" w:pos="13740"/>
-          <w:tab w:val="left" w:pos="14656"/>
-        </w:tabs>
-        <w:contextualSpacing w:val="0"/>
-        <w:jc w:val="left"/>
-      </w:pPr>
-      <w:r>
-        <w:t xml:space="preserve">    &lt;p&gt;</w:t>
-      </w:r>
-    </w:p>
-    <w:p>
-      <w:pPr>
-        <w:tabs>
-          <w:tab w:val="left" w:pos="916"/>
-          <w:tab w:val="left" w:pos="1832"/>
-          <w:tab w:val="left" w:pos="2748"/>
-          <w:tab w:val="left" w:pos="3664"/>
-          <w:tab w:val="left" w:pos="4580"/>
-          <w:tab w:val="left" w:pos="5496"/>
-          <w:tab w:val="left" w:pos="6412"/>
-          <w:tab w:val="left" w:pos="7328"/>
-          <w:tab w:val="left" w:pos="8244"/>
-          <w:tab w:val="left" w:pos="9160"/>
-          <w:tab w:val="left" w:pos="10076"/>
-          <w:tab w:val="left" w:pos="10992"/>
-          <w:tab w:val="left" w:pos="11908"/>
-          <w:tab w:val="left" w:pos="12824"/>
-          <w:tab w:val="left" w:pos="13740"/>
-          <w:tab w:val="left" w:pos="14656"/>
-        </w:tabs>
-        <w:contextualSpacing w:val="0"/>
-        <w:jc w:val="left"/>
-      </w:pPr>
-      <w:r>
-        <w:t xml:space="preserve">        Café, pâtisseries, sandwichs et bonne humeur sont</w:t>
-      </w:r>
-    </w:p>
-    <w:p>
-      <w:pPr>
-        <w:tabs>
-          <w:tab w:val="left" w:pos="916"/>
-          <w:tab w:val="left" w:pos="1832"/>
-          <w:tab w:val="left" w:pos="2748"/>
-          <w:tab w:val="left" w:pos="3664"/>
-          <w:tab w:val="left" w:pos="4580"/>
-          <w:tab w:val="left" w:pos="5496"/>
-          <w:tab w:val="left" w:pos="6412"/>
-          <w:tab w:val="left" w:pos="7328"/>
-          <w:tab w:val="left" w:pos="8244"/>
-          <w:tab w:val="left" w:pos="9160"/>
-          <w:tab w:val="left" w:pos="10076"/>
-          <w:tab w:val="left" w:pos="10992"/>
-          <w:tab w:val="left" w:pos="11908"/>
-          <w:tab w:val="left" w:pos="12824"/>
-          <w:tab w:val="left" w:pos="13740"/>
-          <w:tab w:val="left" w:pos="14656"/>
-        </w:tabs>
-        <w:contextualSpacing w:val="0"/>
-        <w:jc w:val="left"/>
-      </w:pPr>
-      <w:r>
-        <w:t xml:space="preserve">        au rendez-vous tous les jours.</w:t>
-      </w:r>
-    </w:p>
-    <w:p>
-      <w:pPr>
-        <w:tabs>
-          <w:tab w:val="left" w:pos="916"/>
-          <w:tab w:val="left" w:pos="1832"/>
-          <w:tab w:val="left" w:pos="2748"/>
-          <w:tab w:val="left" w:pos="3664"/>
-          <w:tab w:val="left" w:pos="4580"/>
-          <w:tab w:val="left" w:pos="5496"/>
-          <w:tab w:val="left" w:pos="6412"/>
-          <w:tab w:val="left" w:pos="7328"/>
-          <w:tab w:val="left" w:pos="8244"/>
-          <w:tab w:val="left" w:pos="9160"/>
-          <w:tab w:val="left" w:pos="10076"/>
-          <w:tab w:val="left" w:pos="10992"/>
-          <w:tab w:val="left" w:pos="11908"/>
-          <w:tab w:val="left" w:pos="12824"/>
-          <w:tab w:val="left" w:pos="13740"/>
-          <w:tab w:val="left" w:pos="14656"/>
-        </w:tabs>
-        <w:contextualSpacing w:val="0"/>
-        <w:jc w:val="left"/>
-      </w:pPr>
-      <w:r>
-        <w:t xml:space="preserve">    &lt;/p&gt;</w:t>
-      </w:r>
-    </w:p>
-    <w:p>
-      <w:pPr>
-        <w:tabs>
-          <w:tab w:val="left" w:pos="916"/>
-          <w:tab w:val="left" w:pos="1832"/>
-          <w:tab w:val="left" w:pos="2748"/>
-          <w:tab w:val="left" w:pos="3664"/>
-          <w:tab w:val="left" w:pos="4580"/>
-          <w:tab w:val="left" w:pos="5496"/>
-          <w:tab w:val="left" w:pos="6412"/>
-          <w:tab w:val="left" w:pos="7328"/>
-          <w:tab w:val="left" w:pos="8244"/>
-          <w:tab w:val="left" w:pos="9160"/>
-          <w:tab w:val="left" w:pos="10076"/>
-          <w:tab w:val="left" w:pos="10992"/>
-          <w:tab w:val="left" w:pos="11908"/>
-          <w:tab w:val="left" w:pos="12824"/>
-          <w:tab w:val="left" w:pos="13740"/>
-          <w:tab w:val="left" w:pos="14656"/>
-        </w:tabs>
-        <w:contextualSpacing w:val="0"/>
-        <w:jc w:val="left"/>
-      </w:pPr>
-      <w:r>
-        <w:t>&lt;/section&gt;</w:t>
-      </w:r>
-    </w:p>
-    <w:p>
-      <w:pPr>
-        <w:tabs>
-          <w:tab w:val="left" w:pos="916"/>
-          <w:tab w:val="left" w:pos="1832"/>
-          <w:tab w:val="left" w:pos="2748"/>
-          <w:tab w:val="left" w:pos="3664"/>
-          <w:tab w:val="left" w:pos="4580"/>
-          <w:tab w:val="left" w:pos="5496"/>
-          <w:tab w:val="left" w:pos="6412"/>
-          <w:tab w:val="left" w:pos="7328"/>
-          <w:tab w:val="left" w:pos="8244"/>
-          <w:tab w:val="left" w:pos="9160"/>
-          <w:tab w:val="left" w:pos="10076"/>
-          <w:tab w:val="left" w:pos="10992"/>
-          <w:tab w:val="left" w:pos="11908"/>
-          <w:tab w:val="left" w:pos="12824"/>
-          <w:tab w:val="left" w:pos="13740"/>
-          <w:tab w:val="left" w:pos="14656"/>
-        </w:tabs>
-        <w:contextualSpacing w:val="0"/>
-        <w:jc w:val="left"/>
-      </w:pPr>
-    </w:p>
-    <w:p>
-      <w:pPr>
-        <w:tabs>
-          <w:tab w:val="left" w:pos="916"/>
-          <w:tab w:val="left" w:pos="1832"/>
-          <w:tab w:val="left" w:pos="2748"/>
-          <w:tab w:val="left" w:pos="3664"/>
-          <w:tab w:val="left" w:pos="4580"/>
-          <w:tab w:val="left" w:pos="5496"/>
-          <w:tab w:val="left" w:pos="6412"/>
-          <w:tab w:val="left" w:pos="7328"/>
-          <w:tab w:val="left" w:pos="8244"/>
-          <w:tab w:val="left" w:pos="9160"/>
-          <w:tab w:val="left" w:pos="10076"/>
-          <w:tab w:val="left" w:pos="10992"/>
-          <w:tab w:val="left" w:pos="11908"/>
-          <w:tab w:val="left" w:pos="12824"/>
-          <w:tab w:val="left" w:pos="13740"/>
-          <w:tab w:val="left" w:pos="14656"/>
-        </w:tabs>
-        <w:contextualSpacing w:val="0"/>
-        <w:jc w:val="left"/>
-      </w:pPr>
-      <w:r>
-        <w:t>&lt;section&gt;</w:t>
-      </w:r>
-    </w:p>
-    <w:p>
-      <w:pPr>
-        <w:tabs>
-          <w:tab w:val="left" w:pos="916"/>
-          <w:tab w:val="left" w:pos="1832"/>
-          <w:tab w:val="left" w:pos="2748"/>
-          <w:tab w:val="left" w:pos="3664"/>
-          <w:tab w:val="left" w:pos="4580"/>
-          <w:tab w:val="left" w:pos="5496"/>
-          <w:tab w:val="left" w:pos="6412"/>
-          <w:tab w:val="left" w:pos="7328"/>
-          <w:tab w:val="left" w:pos="8244"/>
-          <w:tab w:val="left" w:pos="9160"/>
-          <w:tab w:val="left" w:pos="10076"/>
-          <w:tab w:val="left" w:pos="10992"/>
-          <w:tab w:val="left" w:pos="11908"/>
-          <w:tab w:val="left" w:pos="12824"/>
-          <w:tab w:val="left" w:pos="13740"/>
-          <w:tab w:val="left" w:pos="14656"/>
-        </w:tabs>
-        <w:contextualSpacing w:val="0"/>
-        <w:jc w:val="left"/>
-      </w:pPr>
-      <w:r>
-        <w:t xml:space="preserve">    &lt;h2&gt;Nos horaires&lt;/h2&gt;</w:t>
-      </w:r>
-    </w:p>
-    <w:p>
-      <w:pPr>
-        <w:tabs>
-          <w:tab w:val="left" w:pos="916"/>
-          <w:tab w:val="left" w:pos="1832"/>
-          <w:tab w:val="left" w:pos="2748"/>
-          <w:tab w:val="left" w:pos="3664"/>
-          <w:tab w:val="left" w:pos="4580"/>
-          <w:tab w:val="left" w:pos="5496"/>
-          <w:tab w:val="left" w:pos="6412"/>
-          <w:tab w:val="left" w:pos="7328"/>
-          <w:tab w:val="left" w:pos="8244"/>
-          <w:tab w:val="left" w:pos="9160"/>
-          <w:tab w:val="left" w:pos="10076"/>
-          <w:tab w:val="left" w:pos="10992"/>
-          <w:tab w:val="left" w:pos="11908"/>
-          <w:tab w:val="left" w:pos="12824"/>
-          <w:tab w:val="left" w:pos="13740"/>
-          <w:tab w:val="left" w:pos="14656"/>
-        </w:tabs>
-        <w:contextualSpacing w:val="0"/>
-        <w:jc w:val="left"/>
-      </w:pPr>
-      <w:r>
-        <w:t xml:space="preserve">    &lt;p&gt;Lundi - Samedi : 8h00 - 18h00&lt;/p&gt;</w:t>
-      </w:r>
-    </w:p>
-    <w:p>
-      <w:pPr>
-        <w:tabs>
-          <w:tab w:val="left" w:pos="916"/>
-          <w:tab w:val="left" w:pos="1832"/>
-          <w:tab w:val="left" w:pos="2748"/>
-          <w:tab w:val="left" w:pos="3664"/>
-          <w:tab w:val="left" w:pos="4580"/>
-          <w:tab w:val="left" w:pos="5496"/>
-          <w:tab w:val="left" w:pos="6412"/>
-          <w:tab w:val="left" w:pos="7328"/>
-          <w:tab w:val="left" w:pos="8244"/>
-          <w:tab w:val="left" w:pos="9160"/>
-          <w:tab w:val="left" w:pos="10076"/>
-          <w:tab w:val="left" w:pos="10992"/>
-          <w:tab w:val="left" w:pos="11908"/>
-          <w:tab w:val="left" w:pos="12824"/>
-          <w:tab w:val="left" w:pos="13740"/>
-          <w:tab w:val="left" w:pos="14656"/>
-        </w:tabs>
-        <w:contextualSpacing w:val="0"/>
-        <w:jc w:val="left"/>
-      </w:pPr>
-      <w:r>
-        <w:t xml:space="preserve">    &lt;p&gt;Dimanche : fermé&lt;/p&gt;</w:t>
-      </w:r>
-    </w:p>
-    <w:p>
-      <w:pPr>
-        <w:tabs>
-          <w:tab w:val="left" w:pos="916"/>
-          <w:tab w:val="left" w:pos="1832"/>
-          <w:tab w:val="left" w:pos="2748"/>
-          <w:tab w:val="left" w:pos="3664"/>
-          <w:tab w:val="left" w:pos="4580"/>
-          <w:tab w:val="left" w:pos="5496"/>
-          <w:tab w:val="left" w:pos="6412"/>
-          <w:tab w:val="left" w:pos="7328"/>
-          <w:tab w:val="left" w:pos="8244"/>
-          <w:tab w:val="left" w:pos="9160"/>
-          <w:tab w:val="left" w:pos="10076"/>
-          <w:tab w:val="left" w:pos="10992"/>
-          <w:tab w:val="left" w:pos="11908"/>
-          <w:tab w:val="left" w:pos="12824"/>
-          <w:tab w:val="left" w:pos="13740"/>
-          <w:tab w:val="left" w:pos="14656"/>
-        </w:tabs>
-        <w:contextualSpacing w:val="0"/>
-        <w:jc w:val="left"/>
-      </w:pPr>
-      <w:r>
-        <w:t>&lt;/section&gt;</w:t>
-      </w:r>
-    </w:p>
-    <w:p/>
-    <w:p>
-      <w:pPr>
-        <w:pBdr>
-          <w:top w:val="single" w:sz="4" w:space="1" w:color="auto"/>
-          <w:left w:val="single" w:sz="4" w:space="4" w:color="auto"/>
-          <w:bottom w:val="single" w:sz="4" w:space="1" w:color="auto"/>
-          <w:right w:val="single" w:sz="4" w:space="4" w:color="auto"/>
-          <w:between w:val="single" w:sz="4" w:space="1" w:color="auto"/>
-          <w:bar w:val="single" w:sz="4" w:color="auto"/>
-        </w:pBdr>
-        <w:rPr>
-          <w:b/>
-          <w:sz w:val="28"/>
-          <w:szCs w:val="28"/>
-        </w:rPr>
-      </w:pPr>
-      <w:r>
-        <w:rPr>
-          <w:sz w:val="28"/>
-          <w:szCs w:val="28"/>
-        </w:rPr>
-        <w:t xml:space="preserve">Annexe </w:t>
-      </w:r>
-      <w:r>
-        <w:rPr>
-          <w:sz w:val="28"/>
-          <w:szCs w:val="28"/>
-        </w:rPr>
-        <w:t>2</w:t>
-      </w:r>
-      <w:r>
-        <w:rPr>
-          <w:sz w:val="28"/>
-          <w:szCs w:val="28"/>
-        </w:rPr>
-        <w:t xml:space="preserve"> </w:t>
-      </w:r>
-      <w:r>
-        <w:rPr>
-          <w:sz w:val="28"/>
-          <w:szCs w:val="28"/>
-        </w:rPr>
-        <w:t xml:space="preserve">- </w:t>
-      </w:r>
-      <w:r>
-        <w:rPr>
-          <w:b/>
-          <w:sz w:val="28"/>
-          <w:szCs w:val="28"/>
-        </w:rPr>
-        <w:t xml:space="preserve">menu.html </w:t>
-      </w:r>
-      <w:r>
-        <w:rPr>
-          <w:b/>
-          <w:sz w:val="28"/>
-          <w:szCs w:val="28"/>
-        </w:rPr>
-        <w:t>-</w:t>
-      </w:r>
-      <w:r>
-        <w:rPr>
-          <w:b/>
-          <w:sz w:val="28"/>
-          <w:szCs w:val="28"/>
-        </w:rPr>
-        <w:t xml:space="preserve"> Page menu</w:t>
-      </w:r>
-    </w:p>
-    <w:p/>
-    <w:p>
-      <w:pPr>
-        <w:tabs>
-          <w:tab w:val="left" w:pos="916"/>
-          <w:tab w:val="left" w:pos="1832"/>
-          <w:tab w:val="left" w:pos="2748"/>
-          <w:tab w:val="left" w:pos="3664"/>
-          <w:tab w:val="left" w:pos="4580"/>
-          <w:tab w:val="left" w:pos="5496"/>
-          <w:tab w:val="left" w:pos="6412"/>
-          <w:tab w:val="left" w:pos="7328"/>
-          <w:tab w:val="left" w:pos="8244"/>
-          <w:tab w:val="left" w:pos="9160"/>
-          <w:tab w:val="left" w:pos="10076"/>
-          <w:tab w:val="left" w:pos="10992"/>
-          <w:tab w:val="left" w:pos="11908"/>
-          <w:tab w:val="left" w:pos="12824"/>
-          <w:tab w:val="left" w:pos="13740"/>
-          <w:tab w:val="left" w:pos="14656"/>
-        </w:tabs>
-        <w:contextualSpacing w:val="0"/>
-        <w:jc w:val="left"/>
-      </w:pPr>
-      <w:r>
-        <w:t>&lt;section&gt;</w:t>
-      </w:r>
-    </w:p>
-    <w:p>
-      <w:pPr>
-        <w:tabs>
-          <w:tab w:val="left" w:pos="916"/>
-          <w:tab w:val="left" w:pos="1832"/>
-          <w:tab w:val="left" w:pos="2748"/>
-          <w:tab w:val="left" w:pos="3664"/>
-          <w:tab w:val="left" w:pos="4580"/>
-          <w:tab w:val="left" w:pos="5496"/>
-          <w:tab w:val="left" w:pos="6412"/>
-          <w:tab w:val="left" w:pos="7328"/>
-          <w:tab w:val="left" w:pos="8244"/>
-          <w:tab w:val="left" w:pos="9160"/>
-          <w:tab w:val="left" w:pos="10076"/>
-          <w:tab w:val="left" w:pos="10992"/>
-          <w:tab w:val="left" w:pos="11908"/>
-          <w:tab w:val="left" w:pos="12824"/>
-          <w:tab w:val="left" w:pos="13740"/>
-          <w:tab w:val="left" w:pos="14656"/>
-        </w:tabs>
-        <w:contextualSpacing w:val="0"/>
-        <w:jc w:val="left"/>
-      </w:pPr>
-      <w:r>
-        <w:t xml:space="preserve">    &lt;h2&gt;</w:t>
-      </w:r>
-      <w:r>
-        <w:rPr>
-          <w:rFonts w:ascii="DejaVu Sans Mono" w:hAnsi="DejaVu Sans Mono" w:cs="DejaVu Sans Mono"/>
-        </w:rPr>
-        <w:t>☕</w:t>
-      </w:r>
-      <w:r>
-        <w:t xml:space="preserve"> Boissons&lt;/h2&gt;</w:t>
-      </w:r>
-    </w:p>
-    <w:p>
-      <w:pPr>
-        <w:tabs>
-          <w:tab w:val="left" w:pos="916"/>
-          <w:tab w:val="left" w:pos="1832"/>
-          <w:tab w:val="left" w:pos="2748"/>
-          <w:tab w:val="left" w:pos="3664"/>
-          <w:tab w:val="left" w:pos="4580"/>
-          <w:tab w:val="left" w:pos="5496"/>
-          <w:tab w:val="left" w:pos="6412"/>
-          <w:tab w:val="left" w:pos="7328"/>
-          <w:tab w:val="left" w:pos="8244"/>
-          <w:tab w:val="left" w:pos="9160"/>
-          <w:tab w:val="left" w:pos="10076"/>
-          <w:tab w:val="left" w:pos="10992"/>
-          <w:tab w:val="left" w:pos="11908"/>
-          <w:tab w:val="left" w:pos="12824"/>
-          <w:tab w:val="left" w:pos="13740"/>
-          <w:tab w:val="left" w:pos="14656"/>
-        </w:tabs>
-        <w:contextualSpacing w:val="0"/>
-        <w:jc w:val="left"/>
-      </w:pPr>
-    </w:p>
-    <w:p>
-      <w:pPr>
-        <w:tabs>
-          <w:tab w:val="left" w:pos="916"/>
-          <w:tab w:val="left" w:pos="1832"/>
-          <w:tab w:val="left" w:pos="2748"/>
-          <w:tab w:val="left" w:pos="3664"/>
-          <w:tab w:val="left" w:pos="4580"/>
-          <w:tab w:val="left" w:pos="5496"/>
-          <w:tab w:val="left" w:pos="6412"/>
-          <w:tab w:val="left" w:pos="7328"/>
-          <w:tab w:val="left" w:pos="8244"/>
-          <w:tab w:val="left" w:pos="9160"/>
-          <w:tab w:val="left" w:pos="10076"/>
-          <w:tab w:val="left" w:pos="10992"/>
-          <w:tab w:val="left" w:pos="11908"/>
-          <w:tab w:val="left" w:pos="12824"/>
-          <w:tab w:val="left" w:pos="13740"/>
-          <w:tab w:val="left" w:pos="14656"/>
-        </w:tabs>
-        <w:contextualSpacing w:val="0"/>
-        <w:jc w:val="left"/>
-      </w:pPr>
-      <w:r>
-        <w:t xml:space="preserve">    &lt;div class="menu-item"&gt;</w:t>
-      </w:r>
-    </w:p>
-    <w:p>
-      <w:pPr>
-        <w:tabs>
-          <w:tab w:val="left" w:pos="916"/>
-          <w:tab w:val="left" w:pos="1832"/>
-          <w:tab w:val="left" w:pos="2748"/>
-          <w:tab w:val="left" w:pos="3664"/>
-          <w:tab w:val="left" w:pos="4580"/>
-          <w:tab w:val="left" w:pos="5496"/>
-          <w:tab w:val="left" w:pos="6412"/>
-          <w:tab w:val="left" w:pos="7328"/>
-          <w:tab w:val="left" w:pos="8244"/>
-          <w:tab w:val="left" w:pos="9160"/>
-          <w:tab w:val="left" w:pos="10076"/>
-          <w:tab w:val="left" w:pos="10992"/>
-          <w:tab w:val="left" w:pos="11908"/>
-          <w:tab w:val="left" w:pos="12824"/>
-          <w:tab w:val="left" w:pos="13740"/>
-          <w:tab w:val="left" w:pos="14656"/>
-        </w:tabs>
-        <w:contextualSpacing w:val="0"/>
-        <w:jc w:val="left"/>
-      </w:pPr>
-      <w:r>
-        <w:t xml:space="preserve">        &lt;h3&gt;Café&lt;/h3&gt;</w:t>
-      </w:r>
-    </w:p>
-    <w:p>
-      <w:pPr>
-        <w:tabs>
-          <w:tab w:val="left" w:pos="916"/>
-          <w:tab w:val="left" w:pos="1832"/>
-          <w:tab w:val="left" w:pos="2748"/>
-          <w:tab w:val="left" w:pos="3664"/>
-          <w:tab w:val="left" w:pos="4580"/>
-          <w:tab w:val="left" w:pos="5496"/>
-          <w:tab w:val="left" w:pos="6412"/>
-          <w:tab w:val="left" w:pos="7328"/>
-          <w:tab w:val="left" w:pos="8244"/>
-          <w:tab w:val="left" w:pos="9160"/>
-          <w:tab w:val="left" w:pos="10076"/>
-          <w:tab w:val="left" w:pos="10992"/>
-          <w:tab w:val="left" w:pos="11908"/>
-          <w:tab w:val="left" w:pos="12824"/>
-          <w:tab w:val="left" w:pos="13740"/>
-          <w:tab w:val="left" w:pos="14656"/>
-        </w:tabs>
-        <w:contextualSpacing w:val="0"/>
-        <w:jc w:val="left"/>
-      </w:pPr>
-      <w:r>
-        <w:t xml:space="preserve">        &lt;p&gt;Un espresso traditionnel&lt;/p&gt;</w:t>
-      </w:r>
-    </w:p>
-    <w:p>
-      <w:pPr>
-        <w:tabs>
-          <w:tab w:val="left" w:pos="916"/>
-          <w:tab w:val="left" w:pos="1832"/>
-          <w:tab w:val="left" w:pos="2748"/>
-          <w:tab w:val="left" w:pos="3664"/>
-          <w:tab w:val="left" w:pos="4580"/>
-          <w:tab w:val="left" w:pos="5496"/>
-          <w:tab w:val="left" w:pos="6412"/>
-          <w:tab w:val="left" w:pos="7328"/>
-          <w:tab w:val="left" w:pos="8244"/>
-          <w:tab w:val="left" w:pos="9160"/>
-          <w:tab w:val="left" w:pos="10076"/>
-          <w:tab w:val="left" w:pos="10992"/>
-          <w:tab w:val="left" w:pos="11908"/>
-          <w:tab w:val="left" w:pos="12824"/>
-          <w:tab w:val="left" w:pos="13740"/>
-          <w:tab w:val="left" w:pos="14656"/>
-        </w:tabs>
-        <w:contextualSpacing w:val="0"/>
-        <w:jc w:val="left"/>
-      </w:pPr>
-      <w:r>
-        <w:t xml:space="preserve">        &lt;strong&gt;2 €&lt;/strong&gt;</w:t>
-      </w:r>
-    </w:p>
-    <w:p>
-      <w:pPr>
-        <w:tabs>
-          <w:tab w:val="left" w:pos="916"/>
-          <w:tab w:val="left" w:pos="1832"/>
-          <w:tab w:val="left" w:pos="2748"/>
-          <w:tab w:val="left" w:pos="3664"/>
-          <w:tab w:val="left" w:pos="4580"/>
-          <w:tab w:val="left" w:pos="5496"/>
-          <w:tab w:val="left" w:pos="6412"/>
-          <w:tab w:val="left" w:pos="7328"/>
-          <w:tab w:val="left" w:pos="8244"/>
-          <w:tab w:val="left" w:pos="9160"/>
-          <w:tab w:val="left" w:pos="10076"/>
-          <w:tab w:val="left" w:pos="10992"/>
-          <w:tab w:val="left" w:pos="11908"/>
-          <w:tab w:val="left" w:pos="12824"/>
-          <w:tab w:val="left" w:pos="13740"/>
-          <w:tab w:val="left" w:pos="14656"/>
-        </w:tabs>
-        <w:contextualSpacing w:val="0"/>
-        <w:jc w:val="left"/>
-      </w:pPr>
-      <w:r>
-        <w:t xml:space="preserve">    &lt;/div&gt;</w:t>
-      </w:r>
-    </w:p>
-    <w:p>
-      <w:pPr>
-        <w:tabs>
-          <w:tab w:val="left" w:pos="916"/>
-          <w:tab w:val="left" w:pos="1832"/>
-          <w:tab w:val="left" w:pos="2748"/>
-          <w:tab w:val="left" w:pos="3664"/>
-          <w:tab w:val="left" w:pos="4580"/>
-          <w:tab w:val="left" w:pos="5496"/>
-          <w:tab w:val="left" w:pos="6412"/>
-          <w:tab w:val="left" w:pos="7328"/>
-          <w:tab w:val="left" w:pos="8244"/>
-          <w:tab w:val="left" w:pos="9160"/>
-          <w:tab w:val="left" w:pos="10076"/>
-          <w:tab w:val="left" w:pos="10992"/>
-          <w:tab w:val="left" w:pos="11908"/>
-          <w:tab w:val="left" w:pos="12824"/>
-          <w:tab w:val="left" w:pos="13740"/>
-          <w:tab w:val="left" w:pos="14656"/>
-        </w:tabs>
-        <w:contextualSpacing w:val="0"/>
-        <w:jc w:val="left"/>
-      </w:pPr>
-    </w:p>
-    <w:p>
-      <w:pPr>
-        <w:tabs>
-          <w:tab w:val="left" w:pos="916"/>
-          <w:tab w:val="left" w:pos="1832"/>
-          <w:tab w:val="left" w:pos="2748"/>
-          <w:tab w:val="left" w:pos="3664"/>
-          <w:tab w:val="left" w:pos="4580"/>
-          <w:tab w:val="left" w:pos="5496"/>
-          <w:tab w:val="left" w:pos="6412"/>
-          <w:tab w:val="left" w:pos="7328"/>
-          <w:tab w:val="left" w:pos="8244"/>
-          <w:tab w:val="left" w:pos="9160"/>
-          <w:tab w:val="left" w:pos="10076"/>
-          <w:tab w:val="left" w:pos="10992"/>
-          <w:tab w:val="left" w:pos="11908"/>
-          <w:tab w:val="left" w:pos="12824"/>
-          <w:tab w:val="left" w:pos="13740"/>
-          <w:tab w:val="left" w:pos="14656"/>
-        </w:tabs>
-        <w:contextualSpacing w:val="0"/>
-        <w:jc w:val="left"/>
-      </w:pPr>
-      <w:r>
-        <w:t xml:space="preserve">    &lt;div class="menu-item"&gt;</w:t>
-      </w:r>
-    </w:p>
-    <w:p>
-      <w:pPr>
-        <w:tabs>
-          <w:tab w:val="left" w:pos="916"/>
-          <w:tab w:val="left" w:pos="1832"/>
-          <w:tab w:val="left" w:pos="2748"/>
-          <w:tab w:val="left" w:pos="3664"/>
-          <w:tab w:val="left" w:pos="4580"/>
-          <w:tab w:val="left" w:pos="5496"/>
-          <w:tab w:val="left" w:pos="6412"/>
-          <w:tab w:val="left" w:pos="7328"/>
-          <w:tab w:val="left" w:pos="8244"/>
-          <w:tab w:val="left" w:pos="9160"/>
-          <w:tab w:val="left" w:pos="10076"/>
-          <w:tab w:val="left" w:pos="10992"/>
-          <w:tab w:val="left" w:pos="11908"/>
-          <w:tab w:val="left" w:pos="12824"/>
-          <w:tab w:val="left" w:pos="13740"/>
-          <w:tab w:val="left" w:pos="14656"/>
-        </w:tabs>
-        <w:contextualSpacing w:val="0"/>
-        <w:jc w:val="left"/>
-      </w:pPr>
-      <w:r>
-        <w:t xml:space="preserve">        &lt;h3&gt;Cappuccino&lt;/h3&gt;</w:t>
-      </w:r>
-    </w:p>
-    <w:p>
-      <w:pPr>
-        <w:tabs>
-          <w:tab w:val="left" w:pos="916"/>
-          <w:tab w:val="left" w:pos="1832"/>
-          <w:tab w:val="left" w:pos="2748"/>
-          <w:tab w:val="left" w:pos="3664"/>
-          <w:tab w:val="left" w:pos="4580"/>
-          <w:tab w:val="left" w:pos="5496"/>
-          <w:tab w:val="left" w:pos="6412"/>
-          <w:tab w:val="left" w:pos="7328"/>
-          <w:tab w:val="left" w:pos="8244"/>
-          <w:tab w:val="left" w:pos="9160"/>
-          <w:tab w:val="left" w:pos="10076"/>
-          <w:tab w:val="left" w:pos="10992"/>
-          <w:tab w:val="left" w:pos="11908"/>
-          <w:tab w:val="left" w:pos="12824"/>
-          <w:tab w:val="left" w:pos="13740"/>
-          <w:tab w:val="left" w:pos="14656"/>
-        </w:tabs>
-        <w:contextualSpacing w:val="0"/>
-        <w:jc w:val="left"/>
-      </w:pPr>
-      <w:r>
-        <w:t xml:space="preserve">        &lt;p&gt;Café, lait chaud et mousse de lait&lt;/p&gt;</w:t>
-      </w:r>
-    </w:p>
-    <w:p>
-      <w:pPr>
-        <w:tabs>
-          <w:tab w:val="left" w:pos="916"/>
-          <w:tab w:val="left" w:pos="1832"/>
-          <w:tab w:val="left" w:pos="2748"/>
-          <w:tab w:val="left" w:pos="3664"/>
-          <w:tab w:val="left" w:pos="4580"/>
-          <w:tab w:val="left" w:pos="5496"/>
-          <w:tab w:val="left" w:pos="6412"/>
-          <w:tab w:val="left" w:pos="7328"/>
-          <w:tab w:val="left" w:pos="8244"/>
-          <w:tab w:val="left" w:pos="9160"/>
-          <w:tab w:val="left" w:pos="10076"/>
-          <w:tab w:val="left" w:pos="10992"/>
-          <w:tab w:val="left" w:pos="11908"/>
-          <w:tab w:val="left" w:pos="12824"/>
-          <w:tab w:val="left" w:pos="13740"/>
-          <w:tab w:val="left" w:pos="14656"/>
-        </w:tabs>
-        <w:contextualSpacing w:val="0"/>
-        <w:jc w:val="left"/>
-      </w:pPr>
-      <w:r>
-        <w:t xml:space="preserve">        &lt;strong&gt;3,50 €&lt;/strong&gt;</w:t>
-      </w:r>
-    </w:p>
-    <w:p>
-      <w:pPr>
-        <w:tabs>
-          <w:tab w:val="left" w:pos="916"/>
-          <w:tab w:val="left" w:pos="1832"/>
-          <w:tab w:val="left" w:pos="2748"/>
-          <w:tab w:val="left" w:pos="3664"/>
-          <w:tab w:val="left" w:pos="4580"/>
-          <w:tab w:val="left" w:pos="5496"/>
-          <w:tab w:val="left" w:pos="6412"/>
-          <w:tab w:val="left" w:pos="7328"/>
-          <w:tab w:val="left" w:pos="8244"/>
-          <w:tab w:val="left" w:pos="9160"/>
-          <w:tab w:val="left" w:pos="10076"/>
-          <w:tab w:val="left" w:pos="10992"/>
-          <w:tab w:val="left" w:pos="11908"/>
-          <w:tab w:val="left" w:pos="12824"/>
-          <w:tab w:val="left" w:pos="13740"/>
-          <w:tab w:val="left" w:pos="14656"/>
-        </w:tabs>
-        <w:contextualSpacing w:val="0"/>
-        <w:jc w:val="left"/>
-      </w:pPr>
-      <w:r>
-        <w:t xml:space="preserve">    &lt;/div&gt;</w:t>
-      </w:r>
-    </w:p>
-    <w:p>
-      <w:pPr>
-        <w:tabs>
-          <w:tab w:val="left" w:pos="916"/>
-          <w:tab w:val="left" w:pos="1832"/>
-          <w:tab w:val="left" w:pos="2748"/>
-          <w:tab w:val="left" w:pos="3664"/>
-          <w:tab w:val="left" w:pos="4580"/>
-          <w:tab w:val="left" w:pos="5496"/>
-          <w:tab w:val="left" w:pos="6412"/>
-          <w:tab w:val="left" w:pos="7328"/>
-          <w:tab w:val="left" w:pos="8244"/>
-          <w:tab w:val="left" w:pos="9160"/>
-          <w:tab w:val="left" w:pos="10076"/>
-          <w:tab w:val="left" w:pos="10992"/>
-          <w:tab w:val="left" w:pos="11908"/>
-          <w:tab w:val="left" w:pos="12824"/>
-          <w:tab w:val="left" w:pos="13740"/>
-          <w:tab w:val="left" w:pos="14656"/>
-        </w:tabs>
-        <w:contextualSpacing w:val="0"/>
-        <w:jc w:val="left"/>
-      </w:pPr>
-    </w:p>
-    <w:p>
-      <w:pPr>
-        <w:tabs>
-          <w:tab w:val="left" w:pos="916"/>
-          <w:tab w:val="left" w:pos="1832"/>
-          <w:tab w:val="left" w:pos="2748"/>
-          <w:tab w:val="left" w:pos="3664"/>
-          <w:tab w:val="left" w:pos="4580"/>
-          <w:tab w:val="left" w:pos="5496"/>
-          <w:tab w:val="left" w:pos="6412"/>
-          <w:tab w:val="left" w:pos="7328"/>
-          <w:tab w:val="left" w:pos="8244"/>
-          <w:tab w:val="left" w:pos="9160"/>
-          <w:tab w:val="left" w:pos="10076"/>
-          <w:tab w:val="left" w:pos="10992"/>
-          <w:tab w:val="left" w:pos="11908"/>
-          <w:tab w:val="left" w:pos="12824"/>
-          <w:tab w:val="left" w:pos="13740"/>
-          <w:tab w:val="left" w:pos="14656"/>
-        </w:tabs>
-        <w:contextualSpacing w:val="0"/>
-        <w:jc w:val="left"/>
-      </w:pPr>
-      <w:r>
-        <w:t xml:space="preserve">    &lt;div class="menu-item"&gt;</w:t>
-      </w:r>
-    </w:p>
-    <w:p>
-      <w:pPr>
-        <w:tabs>
-          <w:tab w:val="left" w:pos="916"/>
-          <w:tab w:val="left" w:pos="1832"/>
-          <w:tab w:val="left" w:pos="2748"/>
-          <w:tab w:val="left" w:pos="3664"/>
-          <w:tab w:val="left" w:pos="4580"/>
-          <w:tab w:val="left" w:pos="5496"/>
-          <w:tab w:val="left" w:pos="6412"/>
-          <w:tab w:val="left" w:pos="7328"/>
-          <w:tab w:val="left" w:pos="8244"/>
-          <w:tab w:val="left" w:pos="9160"/>
-          <w:tab w:val="left" w:pos="10076"/>
-          <w:tab w:val="left" w:pos="10992"/>
-          <w:tab w:val="left" w:pos="11908"/>
-          <w:tab w:val="left" w:pos="12824"/>
-          <w:tab w:val="left" w:pos="13740"/>
-          <w:tab w:val="left" w:pos="14656"/>
-        </w:tabs>
-        <w:contextualSpacing w:val="0"/>
-        <w:jc w:val="left"/>
-      </w:pPr>
-      <w:r>
-        <w:t xml:space="preserve">        &lt;h3&gt;Thé&lt;/h3&gt;</w:t>
-      </w:r>
-    </w:p>
-    <w:p>
-      <w:pPr>
-        <w:tabs>
-          <w:tab w:val="left" w:pos="916"/>
-          <w:tab w:val="left" w:pos="1832"/>
-          <w:tab w:val="left" w:pos="2748"/>
-          <w:tab w:val="left" w:pos="3664"/>
-          <w:tab w:val="left" w:pos="4580"/>
-          <w:tab w:val="left" w:pos="5496"/>
-          <w:tab w:val="left" w:pos="6412"/>
-          <w:tab w:val="left" w:pos="7328"/>
-          <w:tab w:val="left" w:pos="8244"/>
-          <w:tab w:val="left" w:pos="9160"/>
-          <w:tab w:val="left" w:pos="10076"/>
-          <w:tab w:val="left" w:pos="10992"/>
-          <w:tab w:val="left" w:pos="11908"/>
-          <w:tab w:val="left" w:pos="12824"/>
-          <w:tab w:val="left" w:pos="13740"/>
-          <w:tab w:val="left" w:pos="14656"/>
-        </w:tabs>
-        <w:contextualSpacing w:val="0"/>
-        <w:jc w:val="left"/>
-      </w:pPr>
-      <w:r>
-        <w:t xml:space="preserve">        &lt;p&gt;Thé vert, noir ou aux fruits&lt;/p&gt;</w:t>
-      </w:r>
-    </w:p>
-    <w:p>
-      <w:pPr>
-        <w:tabs>
-          <w:tab w:val="left" w:pos="916"/>
-          <w:tab w:val="left" w:pos="1832"/>
-          <w:tab w:val="left" w:pos="2748"/>
-          <w:tab w:val="left" w:pos="3664"/>
-          <w:tab w:val="left" w:pos="4580"/>
-          <w:tab w:val="left" w:pos="5496"/>
-          <w:tab w:val="left" w:pos="6412"/>
-          <w:tab w:val="left" w:pos="7328"/>
-          <w:tab w:val="left" w:pos="8244"/>
-          <w:tab w:val="left" w:pos="9160"/>
-          <w:tab w:val="left" w:pos="10076"/>
-          <w:tab w:val="left" w:pos="10992"/>
-          <w:tab w:val="left" w:pos="11908"/>
-          <w:tab w:val="left" w:pos="12824"/>
-          <w:tab w:val="left" w:pos="13740"/>
-          <w:tab w:val="left" w:pos="14656"/>
-        </w:tabs>
-        <w:contextualSpacing w:val="0"/>
-        <w:jc w:val="left"/>
-      </w:pPr>
-      <w:r>
-        <w:t xml:space="preserve">        &lt;strong&gt;3 €&lt;/strong&gt;</w:t>
-      </w:r>
-    </w:p>
-    <w:p>
-      <w:pPr>
-        <w:tabs>
-          <w:tab w:val="left" w:pos="916"/>
-          <w:tab w:val="left" w:pos="1832"/>
-          <w:tab w:val="left" w:pos="2748"/>
-          <w:tab w:val="left" w:pos="3664"/>
-          <w:tab w:val="left" w:pos="4580"/>
-          <w:tab w:val="left" w:pos="5496"/>
-          <w:tab w:val="left" w:pos="6412"/>
-          <w:tab w:val="left" w:pos="7328"/>
-          <w:tab w:val="left" w:pos="8244"/>
-          <w:tab w:val="left" w:pos="9160"/>
-          <w:tab w:val="left" w:pos="10076"/>
-          <w:tab w:val="left" w:pos="10992"/>
-          <w:tab w:val="left" w:pos="11908"/>
-          <w:tab w:val="left" w:pos="12824"/>
-          <w:tab w:val="left" w:pos="13740"/>
-          <w:tab w:val="left" w:pos="14656"/>
-        </w:tabs>
-        <w:contextualSpacing w:val="0"/>
-        <w:jc w:val="left"/>
-      </w:pPr>
-      <w:r>
-        <w:t xml:space="preserve">    &lt;/div&gt;</w:t>
-      </w:r>
-    </w:p>
-    <w:p>
-      <w:pPr>
-        <w:tabs>
-          <w:tab w:val="left" w:pos="916"/>
-          <w:tab w:val="left" w:pos="1832"/>
-          <w:tab w:val="left" w:pos="2748"/>
-          <w:tab w:val="left" w:pos="3664"/>
-          <w:tab w:val="left" w:pos="4580"/>
-          <w:tab w:val="left" w:pos="5496"/>
-          <w:tab w:val="left" w:pos="6412"/>
-          <w:tab w:val="left" w:pos="7328"/>
-          <w:tab w:val="left" w:pos="8244"/>
-          <w:tab w:val="left" w:pos="9160"/>
-          <w:tab w:val="left" w:pos="10076"/>
-          <w:tab w:val="left" w:pos="10992"/>
-          <w:tab w:val="left" w:pos="11908"/>
-          <w:tab w:val="left" w:pos="12824"/>
-          <w:tab w:val="left" w:pos="13740"/>
-          <w:tab w:val="left" w:pos="14656"/>
-        </w:tabs>
-        <w:contextualSpacing w:val="0"/>
-        <w:jc w:val="left"/>
-      </w:pPr>
-      <w:r>
-        <w:t>&lt;/section&gt;</w:t>
-      </w:r>
-    </w:p>
-    <w:p>
-      <w:pPr>
-        <w:tabs>
-          <w:tab w:val="left" w:pos="916"/>
-          <w:tab w:val="left" w:pos="1832"/>
-          <w:tab w:val="left" w:pos="2748"/>
-          <w:tab w:val="left" w:pos="3664"/>
-          <w:tab w:val="left" w:pos="4580"/>
-          <w:tab w:val="left" w:pos="5496"/>
-          <w:tab w:val="left" w:pos="6412"/>
-          <w:tab w:val="left" w:pos="7328"/>
-          <w:tab w:val="left" w:pos="8244"/>
-          <w:tab w:val="left" w:pos="9160"/>
-          <w:tab w:val="left" w:pos="10076"/>
-          <w:tab w:val="left" w:pos="10992"/>
-          <w:tab w:val="left" w:pos="11908"/>
-          <w:tab w:val="left" w:pos="12824"/>
-          <w:tab w:val="left" w:pos="13740"/>
-          <w:tab w:val="left" w:pos="14656"/>
-        </w:tabs>
-        <w:contextualSpacing w:val="0"/>
-        <w:jc w:val="left"/>
-      </w:pPr>
-    </w:p>
-    <w:p>
-      <w:pPr>
-        <w:tabs>
-          <w:tab w:val="left" w:pos="916"/>
-          <w:tab w:val="left" w:pos="1832"/>
-          <w:tab w:val="left" w:pos="2748"/>
-          <w:tab w:val="left" w:pos="3664"/>
-          <w:tab w:val="left" w:pos="4580"/>
-          <w:tab w:val="left" w:pos="5496"/>
-          <w:tab w:val="left" w:pos="6412"/>
-          <w:tab w:val="left" w:pos="7328"/>
-          <w:tab w:val="left" w:pos="8244"/>
-          <w:tab w:val="left" w:pos="9160"/>
-          <w:tab w:val="left" w:pos="10076"/>
-          <w:tab w:val="left" w:pos="10992"/>
-          <w:tab w:val="left" w:pos="11908"/>
-          <w:tab w:val="left" w:pos="12824"/>
-          <w:tab w:val="left" w:pos="13740"/>
-          <w:tab w:val="left" w:pos="14656"/>
-        </w:tabs>
-        <w:contextualSpacing w:val="0"/>
-        <w:jc w:val="left"/>
-      </w:pPr>
-      <w:r>
-        <w:t>&lt;section&gt;</w:t>
-      </w:r>
-    </w:p>
-    <w:p>
-      <w:pPr>
-        <w:tabs>
-          <w:tab w:val="left" w:pos="916"/>
-          <w:tab w:val="left" w:pos="1832"/>
-          <w:tab w:val="left" w:pos="2748"/>
-          <w:tab w:val="left" w:pos="3664"/>
-          <w:tab w:val="left" w:pos="4580"/>
-          <w:tab w:val="left" w:pos="5496"/>
-          <w:tab w:val="left" w:pos="6412"/>
-          <w:tab w:val="left" w:pos="7328"/>
-          <w:tab w:val="left" w:pos="8244"/>
-          <w:tab w:val="left" w:pos="9160"/>
-          <w:tab w:val="left" w:pos="10076"/>
-          <w:tab w:val="left" w:pos="10992"/>
-          <w:tab w:val="left" w:pos="11908"/>
-          <w:tab w:val="left" w:pos="12824"/>
-          <w:tab w:val="left" w:pos="13740"/>
-          <w:tab w:val="left" w:pos="14656"/>
-        </w:tabs>
-        <w:contextualSpacing w:val="0"/>
-        <w:jc w:val="left"/>
-      </w:pPr>
-      <w:r>
-        <w:t xml:space="preserve">    &lt;h2&gt;🥐 À manger&lt;/h2&gt;</w:t>
-      </w:r>
-    </w:p>
-    <w:p>
-      <w:pPr>
-        <w:tabs>
-          <w:tab w:val="left" w:pos="916"/>
-          <w:tab w:val="left" w:pos="1832"/>
-          <w:tab w:val="left" w:pos="2748"/>
-          <w:tab w:val="left" w:pos="3664"/>
-          <w:tab w:val="left" w:pos="4580"/>
-          <w:tab w:val="left" w:pos="5496"/>
-          <w:tab w:val="left" w:pos="6412"/>
-          <w:tab w:val="left" w:pos="7328"/>
-          <w:tab w:val="left" w:pos="8244"/>
-          <w:tab w:val="left" w:pos="9160"/>
-          <w:tab w:val="left" w:pos="10076"/>
-          <w:tab w:val="left" w:pos="10992"/>
-          <w:tab w:val="left" w:pos="11908"/>
-          <w:tab w:val="left" w:pos="12824"/>
-          <w:tab w:val="left" w:pos="13740"/>
-          <w:tab w:val="left" w:pos="14656"/>
-        </w:tabs>
-        <w:contextualSpacing w:val="0"/>
-        <w:jc w:val="left"/>
-      </w:pPr>
-    </w:p>
-    <w:p>
-      <w:pPr>
-        <w:tabs>
-          <w:tab w:val="left" w:pos="916"/>
-          <w:tab w:val="left" w:pos="1832"/>
-          <w:tab w:val="left" w:pos="2748"/>
-          <w:tab w:val="left" w:pos="3664"/>
-          <w:tab w:val="left" w:pos="4580"/>
-          <w:tab w:val="left" w:pos="5496"/>
-          <w:tab w:val="left" w:pos="6412"/>
-          <w:tab w:val="left" w:pos="7328"/>
-          <w:tab w:val="left" w:pos="8244"/>
-          <w:tab w:val="left" w:pos="9160"/>
-          <w:tab w:val="left" w:pos="10076"/>
-          <w:tab w:val="left" w:pos="10992"/>
-          <w:tab w:val="left" w:pos="11908"/>
-          <w:tab w:val="left" w:pos="12824"/>
-          <w:tab w:val="left" w:pos="13740"/>
-          <w:tab w:val="left" w:pos="14656"/>
-        </w:tabs>
-        <w:contextualSpacing w:val="0"/>
-        <w:jc w:val="left"/>
-      </w:pPr>
-      <w:r>
-        <w:t xml:space="preserve">    &lt;div class="menu-item"&gt;</w:t>
-      </w:r>
-    </w:p>
-    <w:p>
-      <w:pPr>
-        <w:tabs>
-          <w:tab w:val="left" w:pos="916"/>
-          <w:tab w:val="left" w:pos="1832"/>
-          <w:tab w:val="left" w:pos="2748"/>
-          <w:tab w:val="left" w:pos="3664"/>
-          <w:tab w:val="left" w:pos="4580"/>
-          <w:tab w:val="left" w:pos="5496"/>
-          <w:tab w:val="left" w:pos="6412"/>
-          <w:tab w:val="left" w:pos="7328"/>
-          <w:tab w:val="left" w:pos="8244"/>
-          <w:tab w:val="left" w:pos="9160"/>
-          <w:tab w:val="left" w:pos="10076"/>
-          <w:tab w:val="left" w:pos="10992"/>
-          <w:tab w:val="left" w:pos="11908"/>
-          <w:tab w:val="left" w:pos="12824"/>
-          <w:tab w:val="left" w:pos="13740"/>
-          <w:tab w:val="left" w:pos="14656"/>
-        </w:tabs>
-        <w:contextualSpacing w:val="0"/>
-        <w:jc w:val="left"/>
-      </w:pPr>
-      <w:r>
-        <w:t xml:space="preserve">        &lt;h3&gt;Croissant&lt;/h3&gt;</w:t>
-      </w:r>
-    </w:p>
-    <w:p>
-      <w:pPr>
-        <w:tabs>
-          <w:tab w:val="left" w:pos="916"/>
-          <w:tab w:val="left" w:pos="1832"/>
-          <w:tab w:val="left" w:pos="2748"/>
-          <w:tab w:val="left" w:pos="3664"/>
-          <w:tab w:val="left" w:pos="4580"/>
-          <w:tab w:val="left" w:pos="5496"/>
-          <w:tab w:val="left" w:pos="6412"/>
-          <w:tab w:val="left" w:pos="7328"/>
-          <w:tab w:val="left" w:pos="8244"/>
-          <w:tab w:val="left" w:pos="9160"/>
-          <w:tab w:val="left" w:pos="10076"/>
-          <w:tab w:val="left" w:pos="10992"/>
-          <w:tab w:val="left" w:pos="11908"/>
-          <w:tab w:val="left" w:pos="12824"/>
-          <w:tab w:val="left" w:pos="13740"/>
-          <w:tab w:val="left" w:pos="14656"/>
-        </w:tabs>
-        <w:contextualSpacing w:val="0"/>
-        <w:jc w:val="left"/>
-      </w:pPr>
-      <w:r>
-        <w:t xml:space="preserve">        &lt;p&gt;Croissant au beurre&lt;/p&gt;</w:t>
-      </w:r>
-    </w:p>
-    <w:p>
-      <w:pPr>
-        <w:tabs>
-          <w:tab w:val="left" w:pos="916"/>
-          <w:tab w:val="left" w:pos="1832"/>
-          <w:tab w:val="left" w:pos="2748"/>
-          <w:tab w:val="left" w:pos="3664"/>
-          <w:tab w:val="left" w:pos="4580"/>
-          <w:tab w:val="left" w:pos="5496"/>
-          <w:tab w:val="left" w:pos="6412"/>
-          <w:tab w:val="left" w:pos="7328"/>
-          <w:tab w:val="left" w:pos="8244"/>
-          <w:tab w:val="left" w:pos="9160"/>
-          <w:tab w:val="left" w:pos="10076"/>
-          <w:tab w:val="left" w:pos="10992"/>
-          <w:tab w:val="left" w:pos="11908"/>
-          <w:tab w:val="left" w:pos="12824"/>
-          <w:tab w:val="left" w:pos="13740"/>
-          <w:tab w:val="left" w:pos="14656"/>
-        </w:tabs>
-        <w:contextualSpacing w:val="0"/>
-        <w:jc w:val="left"/>
-      </w:pPr>
-      <w:r>
-        <w:t xml:space="preserve">        &lt;strong&gt;2,50 €&lt;/strong&gt;</w:t>
-      </w:r>
-    </w:p>
-    <w:p>
-      <w:pPr>
-        <w:tabs>
-          <w:tab w:val="left" w:pos="916"/>
-          <w:tab w:val="left" w:pos="1832"/>
-          <w:tab w:val="left" w:pos="2748"/>
-          <w:tab w:val="left" w:pos="3664"/>
-          <w:tab w:val="left" w:pos="4580"/>
-          <w:tab w:val="left" w:pos="5496"/>
-          <w:tab w:val="left" w:pos="6412"/>
-          <w:tab w:val="left" w:pos="7328"/>
-          <w:tab w:val="left" w:pos="8244"/>
-          <w:tab w:val="left" w:pos="9160"/>
-          <w:tab w:val="left" w:pos="10076"/>
-          <w:tab w:val="left" w:pos="10992"/>
-          <w:tab w:val="left" w:pos="11908"/>
-          <w:tab w:val="left" w:pos="12824"/>
-          <w:tab w:val="left" w:pos="13740"/>
-          <w:tab w:val="left" w:pos="14656"/>
-        </w:tabs>
-        <w:contextualSpacing w:val="0"/>
-        <w:jc w:val="left"/>
-      </w:pPr>
-      <w:r>
-        <w:t xml:space="preserve">    &lt;/div&gt;</w:t>
-      </w:r>
-    </w:p>
-    <w:p>
-      <w:pPr>
-        <w:tabs>
-          <w:tab w:val="left" w:pos="916"/>
-          <w:tab w:val="left" w:pos="1832"/>
-          <w:tab w:val="left" w:pos="2748"/>
-          <w:tab w:val="left" w:pos="3664"/>
-          <w:tab w:val="left" w:pos="4580"/>
-          <w:tab w:val="left" w:pos="5496"/>
-          <w:tab w:val="left" w:pos="6412"/>
-          <w:tab w:val="left" w:pos="7328"/>
-          <w:tab w:val="left" w:pos="8244"/>
-          <w:tab w:val="left" w:pos="9160"/>
-          <w:tab w:val="left" w:pos="10076"/>
-          <w:tab w:val="left" w:pos="10992"/>
-          <w:tab w:val="left" w:pos="11908"/>
-          <w:tab w:val="left" w:pos="12824"/>
-          <w:tab w:val="left" w:pos="13740"/>
-          <w:tab w:val="left" w:pos="14656"/>
-        </w:tabs>
-        <w:contextualSpacing w:val="0"/>
-        <w:jc w:val="left"/>
-      </w:pPr>
-    </w:p>
-    <w:p>
-      <w:pPr>
-        <w:tabs>
-          <w:tab w:val="left" w:pos="916"/>
-          <w:tab w:val="left" w:pos="1832"/>
-          <w:tab w:val="left" w:pos="2748"/>
-          <w:tab w:val="left" w:pos="3664"/>
-          <w:tab w:val="left" w:pos="4580"/>
-          <w:tab w:val="left" w:pos="5496"/>
-          <w:tab w:val="left" w:pos="6412"/>
-          <w:tab w:val="left" w:pos="7328"/>
-          <w:tab w:val="left" w:pos="8244"/>
-          <w:tab w:val="left" w:pos="9160"/>
-          <w:tab w:val="left" w:pos="10076"/>
-          <w:tab w:val="left" w:pos="10992"/>
-          <w:tab w:val="left" w:pos="11908"/>
-          <w:tab w:val="left" w:pos="12824"/>
-          <w:tab w:val="left" w:pos="13740"/>
-          <w:tab w:val="left" w:pos="14656"/>
-        </w:tabs>
-        <w:contextualSpacing w:val="0"/>
-        <w:jc w:val="left"/>
-      </w:pPr>
-      <w:r>
-        <w:t xml:space="preserve">    &lt;div class="menu-item"&gt;</w:t>
-      </w:r>
-    </w:p>
-    <w:p>
-      <w:pPr>
-        <w:tabs>
-          <w:tab w:val="left" w:pos="916"/>
-          <w:tab w:val="left" w:pos="1832"/>
-          <w:tab w:val="left" w:pos="2748"/>
-          <w:tab w:val="left" w:pos="3664"/>
-          <w:tab w:val="left" w:pos="4580"/>
-          <w:tab w:val="left" w:pos="5496"/>
-          <w:tab w:val="left" w:pos="6412"/>
-          <w:tab w:val="left" w:pos="7328"/>
-          <w:tab w:val="left" w:pos="8244"/>
-          <w:tab w:val="left" w:pos="9160"/>
-          <w:tab w:val="left" w:pos="10076"/>
-          <w:tab w:val="left" w:pos="10992"/>
-          <w:tab w:val="left" w:pos="11908"/>
-          <w:tab w:val="left" w:pos="12824"/>
-          <w:tab w:val="left" w:pos="13740"/>
-          <w:tab w:val="left" w:pos="14656"/>
-        </w:tabs>
-        <w:contextualSpacing w:val="0"/>
-        <w:jc w:val="left"/>
-      </w:pPr>
-      <w:r>
-        <w:t xml:space="preserve">        &lt;h3&gt;Part de gâteau&lt;/h3&gt;</w:t>
-      </w:r>
-    </w:p>
-    <w:p>
-      <w:pPr>
-        <w:tabs>
-          <w:tab w:val="left" w:pos="916"/>
-          <w:tab w:val="left" w:pos="1832"/>
-          <w:tab w:val="left" w:pos="2748"/>
-          <w:tab w:val="left" w:pos="3664"/>
-          <w:tab w:val="left" w:pos="4580"/>
-          <w:tab w:val="left" w:pos="5496"/>
-          <w:tab w:val="left" w:pos="6412"/>
-          <w:tab w:val="left" w:pos="7328"/>
-          <w:tab w:val="left" w:pos="8244"/>
-          <w:tab w:val="left" w:pos="9160"/>
-          <w:tab w:val="left" w:pos="10076"/>
-          <w:tab w:val="left" w:pos="10992"/>
-          <w:tab w:val="left" w:pos="11908"/>
-          <w:tab w:val="left" w:pos="12824"/>
-          <w:tab w:val="left" w:pos="13740"/>
-          <w:tab w:val="left" w:pos="14656"/>
-        </w:tabs>
-        <w:contextualSpacing w:val="0"/>
-        <w:jc w:val="left"/>
-      </w:pPr>
-      <w:r>
-        <w:t xml:space="preserve">        &lt;p&gt;Gâteau maison selon les envies du jour&lt;/p&gt;</w:t>
-      </w:r>
-    </w:p>
-    <w:p>
-      <w:pPr>
-        <w:tabs>
-          <w:tab w:val="left" w:pos="916"/>
-          <w:tab w:val="left" w:pos="1832"/>
-          <w:tab w:val="left" w:pos="2748"/>
-          <w:tab w:val="left" w:pos="3664"/>
-          <w:tab w:val="left" w:pos="4580"/>
-          <w:tab w:val="left" w:pos="5496"/>
-          <w:tab w:val="left" w:pos="6412"/>
-          <w:tab w:val="left" w:pos="7328"/>
-          <w:tab w:val="left" w:pos="8244"/>
-          <w:tab w:val="left" w:pos="9160"/>
-          <w:tab w:val="left" w:pos="10076"/>
-          <w:tab w:val="left" w:pos="10992"/>
-          <w:tab w:val="left" w:pos="11908"/>
-          <w:tab w:val="left" w:pos="12824"/>
-          <w:tab w:val="left" w:pos="13740"/>
-          <w:tab w:val="left" w:pos="14656"/>
-        </w:tabs>
-        <w:contextualSpacing w:val="0"/>
-        <w:jc w:val="left"/>
-      </w:pPr>
-      <w:r>
-        <w:t xml:space="preserve">        &lt;strong&gt;4 €&lt;/strong&gt;</w:t>
-      </w:r>
-    </w:p>
-    <w:p>
-      <w:pPr>
-        <w:tabs>
-          <w:tab w:val="left" w:pos="916"/>
-          <w:tab w:val="left" w:pos="1832"/>
-          <w:tab w:val="left" w:pos="2748"/>
-          <w:tab w:val="left" w:pos="3664"/>
-          <w:tab w:val="left" w:pos="4580"/>
-          <w:tab w:val="left" w:pos="5496"/>
-          <w:tab w:val="left" w:pos="6412"/>
-          <w:tab w:val="left" w:pos="7328"/>
-          <w:tab w:val="left" w:pos="8244"/>
-          <w:tab w:val="left" w:pos="9160"/>
-          <w:tab w:val="left" w:pos="10076"/>
-          <w:tab w:val="left" w:pos="10992"/>
-          <w:tab w:val="left" w:pos="11908"/>
-          <w:tab w:val="left" w:pos="12824"/>
-          <w:tab w:val="left" w:pos="13740"/>
-          <w:tab w:val="left" w:pos="14656"/>
-        </w:tabs>
-        <w:contextualSpacing w:val="0"/>
-        <w:jc w:val="left"/>
-      </w:pPr>
-      <w:r>
-        <w:t xml:space="preserve">    &lt;/div&gt;</w:t>
-      </w:r>
-    </w:p>
-    <w:p>
-      <w:pPr>
-        <w:tabs>
-          <w:tab w:val="left" w:pos="916"/>
-          <w:tab w:val="left" w:pos="1832"/>
-          <w:tab w:val="left" w:pos="2748"/>
-          <w:tab w:val="left" w:pos="3664"/>
-          <w:tab w:val="left" w:pos="4580"/>
-          <w:tab w:val="left" w:pos="5496"/>
-          <w:tab w:val="left" w:pos="6412"/>
-          <w:tab w:val="left" w:pos="7328"/>
-          <w:tab w:val="left" w:pos="8244"/>
-          <w:tab w:val="left" w:pos="9160"/>
-          <w:tab w:val="left" w:pos="10076"/>
-          <w:tab w:val="left" w:pos="10992"/>
-          <w:tab w:val="left" w:pos="11908"/>
-          <w:tab w:val="left" w:pos="12824"/>
-          <w:tab w:val="left" w:pos="13740"/>
-          <w:tab w:val="left" w:pos="14656"/>
-        </w:tabs>
-        <w:contextualSpacing w:val="0"/>
-        <w:jc w:val="left"/>
-      </w:pPr>
-    </w:p>
-    <w:p>
-      <w:pPr>
-        <w:tabs>
-          <w:tab w:val="left" w:pos="916"/>
-          <w:tab w:val="left" w:pos="1832"/>
-          <w:tab w:val="left" w:pos="2748"/>
-          <w:tab w:val="left" w:pos="3664"/>
-          <w:tab w:val="left" w:pos="4580"/>
-          <w:tab w:val="left" w:pos="5496"/>
-          <w:tab w:val="left" w:pos="6412"/>
-          <w:tab w:val="left" w:pos="7328"/>
-          <w:tab w:val="left" w:pos="8244"/>
-          <w:tab w:val="left" w:pos="9160"/>
-          <w:tab w:val="left" w:pos="10076"/>
-          <w:tab w:val="left" w:pos="10992"/>
-          <w:tab w:val="left" w:pos="11908"/>
-          <w:tab w:val="left" w:pos="12824"/>
-          <w:tab w:val="left" w:pos="13740"/>
-          <w:tab w:val="left" w:pos="14656"/>
-        </w:tabs>
-        <w:contextualSpacing w:val="0"/>
-        <w:jc w:val="left"/>
-      </w:pPr>
-      <w:r>
-        <w:t xml:space="preserve">    &lt;div class="menu-item"&gt;</w:t>
-      </w:r>
-    </w:p>
-    <w:p>
-      <w:pPr>
-        <w:tabs>
-          <w:tab w:val="left" w:pos="916"/>
-          <w:tab w:val="left" w:pos="1832"/>
-          <w:tab w:val="left" w:pos="2748"/>
-          <w:tab w:val="left" w:pos="3664"/>
-          <w:tab w:val="left" w:pos="4580"/>
-          <w:tab w:val="left" w:pos="5496"/>
-          <w:tab w:val="left" w:pos="6412"/>
-          <w:tab w:val="left" w:pos="7328"/>
-          <w:tab w:val="left" w:pos="8244"/>
-          <w:tab w:val="left" w:pos="9160"/>
-          <w:tab w:val="left" w:pos="10076"/>
-          <w:tab w:val="left" w:pos="10992"/>
-          <w:tab w:val="left" w:pos="11908"/>
-          <w:tab w:val="left" w:pos="12824"/>
-          <w:tab w:val="left" w:pos="13740"/>
-          <w:tab w:val="left" w:pos="14656"/>
-        </w:tabs>
-        <w:contextualSpacing w:val="0"/>
-        <w:jc w:val="left"/>
-      </w:pPr>
-      <w:r>
-        <w:t xml:space="preserve">        &lt;h3&gt;Sandwich&lt;/h3&gt;</w:t>
-      </w:r>
-    </w:p>
-    <w:p>
-      <w:pPr>
-        <w:tabs>
-          <w:tab w:val="left" w:pos="916"/>
-          <w:tab w:val="left" w:pos="1832"/>
-          <w:tab w:val="left" w:pos="2748"/>
-          <w:tab w:val="left" w:pos="3664"/>
-          <w:tab w:val="left" w:pos="4580"/>
-          <w:tab w:val="left" w:pos="5496"/>
-          <w:tab w:val="left" w:pos="6412"/>
-          <w:tab w:val="left" w:pos="7328"/>
-          <w:tab w:val="left" w:pos="8244"/>
-          <w:tab w:val="left" w:pos="9160"/>
-          <w:tab w:val="left" w:pos="10076"/>
-          <w:tab w:val="left" w:pos="10992"/>
-          <w:tab w:val="left" w:pos="11908"/>
-          <w:tab w:val="left" w:pos="12824"/>
-          <w:tab w:val="left" w:pos="13740"/>
-          <w:tab w:val="left" w:pos="14656"/>
-        </w:tabs>
-        <w:contextualSpacing w:val="0"/>
-        <w:jc w:val="left"/>
-      </w:pPr>
-      <w:r>
-        <w:t xml:space="preserve">        &lt;p&gt;Pain frais, jambon, fromage et salade&lt;/p&gt;</w:t>
-      </w:r>
-    </w:p>
-    <w:p>
-      <w:pPr>
-        <w:tabs>
-          <w:tab w:val="left" w:pos="916"/>
-          <w:tab w:val="left" w:pos="1832"/>
-          <w:tab w:val="left" w:pos="2748"/>
-          <w:tab w:val="left" w:pos="3664"/>
-          <w:tab w:val="left" w:pos="4580"/>
-          <w:tab w:val="left" w:pos="5496"/>
-          <w:tab w:val="left" w:pos="6412"/>
-          <w:tab w:val="left" w:pos="7328"/>
-          <w:tab w:val="left" w:pos="8244"/>
-          <w:tab w:val="left" w:pos="9160"/>
-          <w:tab w:val="left" w:pos="10076"/>
-          <w:tab w:val="left" w:pos="10992"/>
-          <w:tab w:val="left" w:pos="11908"/>
-          <w:tab w:val="left" w:pos="12824"/>
-          <w:tab w:val="left" w:pos="13740"/>
-          <w:tab w:val="left" w:pos="14656"/>
-        </w:tabs>
-        <w:contextualSpacing w:val="0"/>
-        <w:jc w:val="left"/>
-      </w:pPr>
-      <w:r>
-        <w:t xml:space="preserve">        &lt;strong&gt;6 €&lt;/strong&gt;</w:t>
-      </w:r>
-    </w:p>
-    <w:p>
-      <w:pPr>
-        <w:tabs>
-          <w:tab w:val="left" w:pos="916"/>
-          <w:tab w:val="left" w:pos="1832"/>
-          <w:tab w:val="left" w:pos="2748"/>
-          <w:tab w:val="left" w:pos="3664"/>
-          <w:tab w:val="left" w:pos="4580"/>
-          <w:tab w:val="left" w:pos="5496"/>
-          <w:tab w:val="left" w:pos="6412"/>
-          <w:tab w:val="left" w:pos="7328"/>
-          <w:tab w:val="left" w:pos="8244"/>
-          <w:tab w:val="left" w:pos="9160"/>
-          <w:tab w:val="left" w:pos="10076"/>
-          <w:tab w:val="left" w:pos="10992"/>
-          <w:tab w:val="left" w:pos="11908"/>
-          <w:tab w:val="left" w:pos="12824"/>
-          <w:tab w:val="left" w:pos="13740"/>
-          <w:tab w:val="left" w:pos="14656"/>
-        </w:tabs>
-        <w:contextualSpacing w:val="0"/>
-        <w:jc w:val="left"/>
-      </w:pPr>
-      <w:r>
-        <w:t xml:space="preserve">    &lt;/div&gt;</w:t>
-      </w:r>
-    </w:p>
-    <w:p>
-      <w:pPr>
-        <w:tabs>
-          <w:tab w:val="left" w:pos="916"/>
-          <w:tab w:val="left" w:pos="1832"/>
-          <w:tab w:val="left" w:pos="2748"/>
-          <w:tab w:val="left" w:pos="3664"/>
-          <w:tab w:val="left" w:pos="4580"/>
-          <w:tab w:val="left" w:pos="5496"/>
-          <w:tab w:val="left" w:pos="6412"/>
-          <w:tab w:val="left" w:pos="7328"/>
-          <w:tab w:val="left" w:pos="8244"/>
-          <w:tab w:val="left" w:pos="9160"/>
-          <w:tab w:val="left" w:pos="10076"/>
-          <w:tab w:val="left" w:pos="10992"/>
-          <w:tab w:val="left" w:pos="11908"/>
-          <w:tab w:val="left" w:pos="12824"/>
-          <w:tab w:val="left" w:pos="13740"/>
-          <w:tab w:val="left" w:pos="14656"/>
-        </w:tabs>
-        <w:contextualSpacing w:val="0"/>
-        <w:jc w:val="left"/>
-      </w:pPr>
-      <w:r>
-        <w:t>&lt;/section&gt;</w:t>
-      </w:r>
-    </w:p>
-    <w:p/>
-    <w:p/>
-    <w:p>
-      <w:pPr>
-        <w:pBdr>
-          <w:top w:val="single" w:sz="4" w:space="1" w:color="auto"/>
-          <w:left w:val="single" w:sz="4" w:space="4" w:color="auto"/>
-          <w:bottom w:val="single" w:sz="4" w:space="1" w:color="auto"/>
-          <w:right w:val="single" w:sz="4" w:space="4" w:color="auto"/>
-          <w:between w:val="single" w:sz="4" w:space="1" w:color="auto"/>
-          <w:bar w:val="single" w:sz="4" w:color="auto"/>
-        </w:pBdr>
-        <w:rPr>
-          <w:b/>
-          <w:sz w:val="28"/>
-          <w:szCs w:val="28"/>
-        </w:rPr>
-      </w:pPr>
-      <w:r>
-        <w:rPr>
-          <w:sz w:val="28"/>
-          <w:szCs w:val="28"/>
-        </w:rPr>
-        <w:t xml:space="preserve">Annexe </w:t>
-      </w:r>
-      <w:r>
-        <w:rPr>
-          <w:sz w:val="28"/>
-          <w:szCs w:val="28"/>
-        </w:rPr>
-        <w:t>3</w:t>
-      </w:r>
-      <w:r>
-        <w:rPr>
-          <w:sz w:val="28"/>
-          <w:szCs w:val="28"/>
-        </w:rPr>
-        <w:t xml:space="preserve"> </w:t>
-      </w:r>
-      <w:r>
-        <w:rPr>
-          <w:sz w:val="28"/>
-          <w:szCs w:val="28"/>
-        </w:rPr>
-        <w:t xml:space="preserve">- </w:t>
-      </w:r>
-      <w:r>
-        <w:rPr>
-          <w:b/>
-          <w:sz w:val="28"/>
-          <w:szCs w:val="28"/>
-        </w:rPr>
-        <w:t>contact</w:t>
-      </w:r>
-      <w:r>
-        <w:rPr>
-          <w:b/>
-          <w:sz w:val="28"/>
-          <w:szCs w:val="28"/>
-        </w:rPr>
-        <w:t xml:space="preserve">.html </w:t>
-      </w:r>
-      <w:r>
-        <w:rPr>
-          <w:b/>
-          <w:sz w:val="28"/>
-          <w:szCs w:val="28"/>
-        </w:rPr>
-        <w:t>-</w:t>
-      </w:r>
-      <w:r>
-        <w:rPr>
-          <w:b/>
-          <w:sz w:val="28"/>
-          <w:szCs w:val="28"/>
-        </w:rPr>
-        <w:t xml:space="preserve"> Page </w:t>
-      </w:r>
-      <w:r>
-        <w:rPr>
-          <w:b/>
-          <w:sz w:val="28"/>
-          <w:szCs w:val="28"/>
-        </w:rPr>
-        <w:t>contact</w:t>
-      </w:r>
-    </w:p>
-    <w:p/>
-    <w:p>
-      <w:r>
-        <w:t>&lt;!-- contact.html --&gt;</w:t>
-      </w:r>
-    </w:p>
-    <w:p>
-      <w:r>
-        <w:t>&lt;!DOCTYPE html&gt;</w:t>
-      </w:r>
-    </w:p>
-    <w:p>
-      <w:r>
-        <w:t xml:space="preserve">&lt;html lang="fr"&gt; </w:t>
-      </w:r>
-    </w:p>
-    <w:p>
-      <w:r>
-        <w:t xml:space="preserve">&lt;head&gt; </w:t>
-      </w:r>
-    </w:p>
-    <w:p>
-      <w:pPr>
-        <w:ind w:left="426"/>
-      </w:pPr>
-      <w:r>
-        <w:t xml:space="preserve">&lt;meta charset="UTF-8"&gt; </w:t>
-      </w:r>
-    </w:p>
-    <w:p>
-      <w:pPr>
-        <w:ind w:left="426"/>
-      </w:pPr>
-      <w:r>
-        <w:t xml:space="preserve">&lt;meta name="viewport" content="width=device-width, initial-scale=1.0"&gt; </w:t>
-      </w:r>
-    </w:p>
-    <w:p>
-      <w:pPr>
-        <w:ind w:left="426"/>
-      </w:pPr>
-      <w:r>
-        <w:t xml:space="preserve">&lt;title&gt;Contact - Le Petit Café&lt;/title&gt; </w:t>
-      </w:r>
-    </w:p>
-    <w:p>
-      <w:pPr>
-        <w:ind w:left="426"/>
-      </w:pPr>
-      <w:r>
-        <w:t xml:space="preserve">&lt;link rel="stylesheet" href="style.css"&gt; </w:t>
-      </w:r>
-    </w:p>
-    <w:p>
-      <w:r>
-        <w:t>&lt;/head&gt;</w:t>
-      </w:r>
-    </w:p>
-    <w:p>
-      <w:r>
-        <w:t>&lt;body&gt;</w:t>
-      </w:r>
-    </w:p>
-    <w:p>
-      <w:r>
-        <w:t xml:space="preserve">&lt;header&gt; </w:t>
-      </w:r>
-    </w:p>
-    <w:p>
-      <w:pPr>
-        <w:ind w:left="426"/>
-      </w:pPr>
-      <w:r>
-        <w:t xml:space="preserve">&lt;h1&gt;☕ Le Petit Café&lt;/h1&gt; </w:t>
-      </w:r>
-    </w:p>
-    <w:p>
-      <w:pPr>
-        <w:ind w:left="426"/>
-      </w:pPr>
-      <w:r>
-        <w:t xml:space="preserve">&lt;p&gt;Nous contacter&lt;/p&gt; </w:t>
-      </w:r>
-    </w:p>
-    <w:p>
-      <w:r>
-        <w:t>&lt;/header&gt;</w:t>
-      </w:r>
-    </w:p>
-    <w:p>
-      <w:r>
-        <w:t xml:space="preserve">&lt;nav&gt; </w:t>
-      </w:r>
-    </w:p>
-    <w:p>
-      <w:pPr>
-        <w:ind w:left="426"/>
-      </w:pPr>
-      <w:r>
-        <w:t xml:space="preserve">&lt;a href="index.html"&gt;Accueil&lt;/a&gt; </w:t>
-      </w:r>
-    </w:p>
-    <w:p>
-      <w:pPr>
-        <w:ind w:left="426"/>
-      </w:pPr>
-      <w:r>
-        <w:t xml:space="preserve">&lt;a href="menu.html"&gt;Menu&lt;/a&gt; </w:t>
-      </w:r>
-    </w:p>
-    <w:p>
-      <w:pPr>
-        <w:ind w:left="426"/>
-      </w:pPr>
-      <w:r>
-        <w:t xml:space="preserve">&lt;a href="contact.html"&gt;Contact&lt;/a&gt; </w:t>
-      </w:r>
-    </w:p>
-    <w:p>
-      <w:r>
-        <w:t>&lt;/nav&gt;</w:t>
-      </w:r>
-    </w:p>
-    <w:p>
-      <w:r>
-        <w:t>&lt;main&gt;</w:t>
-      </w:r>
-    </w:p>
-    <w:p>
-      <w:pPr>
-        <w:ind w:left="426"/>
-      </w:pPr>
-      <w:r>
-        <w:t>&lt;section&gt;</w:t>
-      </w:r>
-    </w:p>
-    <w:p>
-      <w:pPr>
-        <w:ind w:left="426"/>
-      </w:pPr>
-      <w:r>
-        <w:t xml:space="preserve">    &lt;h2&gt;📍 Nous trouver&lt;/h2&gt;</w:t>
-      </w:r>
-    </w:p>
-    <w:p>
-      <w:pPr>
-        <w:ind w:left="426"/>
-      </w:pPr>
-    </w:p>
-    <w:p>
-      <w:pPr>
-        <w:ind w:left="426"/>
-      </w:pPr>
-      <w:r>
-        <w:t xml:space="preserve">    &lt;p&gt;</w:t>
-      </w:r>
-    </w:p>
-    <w:p>
-      <w:pPr>
-        <w:ind w:left="426"/>
-      </w:pPr>
-      <w:r>
-        <w:t xml:space="preserve">        &lt;strong&gt;Le Petit Café&lt;/strong&gt;&lt;br&gt;</w:t>
-      </w:r>
-    </w:p>
-    <w:p>
-      <w:pPr>
-        <w:ind w:left="426"/>
-      </w:pPr>
-      <w:r>
-        <w:t xml:space="preserve">        12 rue du Café&lt;br&gt;</w:t>
-      </w:r>
-    </w:p>
-    <w:p>
-      <w:pPr>
-        <w:ind w:left="426"/>
-      </w:pPr>
-      <w:r>
-        <w:t xml:space="preserve">        06000 Nice</w:t>
-      </w:r>
-    </w:p>
-    <w:p>
-      <w:pPr>
-        <w:ind w:left="426"/>
-      </w:pPr>
-      <w:r>
-        <w:t xml:space="preserve">    &lt;/p&gt;</w:t>
-      </w:r>
-    </w:p>
-    <w:p/>
-    <w:p>
-      <w:r>
-        <w:t xml:space="preserve">    &lt;p&gt;</w:t>
-      </w:r>
-    </w:p>
-    <w:p>
-      <w:r>
-        <w:t xml:space="preserve">        04 </w:t>
-      </w:r>
-      <w:r>
-        <w:t>93</w:t>
-      </w:r>
-      <w:r>
-        <w:t xml:space="preserve"> 00 00 00</w:t>
-      </w:r>
-    </w:p>
-    <w:p>
-      <w:r>
-        <w:t xml:space="preserve">    &lt;/p&gt;</w:t>
-      </w:r>
-    </w:p>
-    <w:p/>
-    <w:p>
-      <w:r>
-        <w:t xml:space="preserve">    &lt;p&gt;</w:t>
-      </w:r>
-    </w:p>
-    <w:p>
-      <w:r>
-        <w:t xml:space="preserve">        </w:t>
-      </w:r>
-      <w:r>
-        <w:rPr>
-          <w:rFonts w:ascii="MS Gothic" w:eastAsia="MS Gothic" w:hAnsi="MS Gothic" w:cs="MS Gothic" w:hint="eastAsia"/>
-        </w:rPr>
-        <w:t>✉</w:t>
-      </w:r>
-      <w:r>
-        <w:t xml:space="preserve"> contact@lepetitcafe.fr</w:t>
-      </w:r>
-    </w:p>
-    <w:p>
-      <w:r>
-        <w:t xml:space="preserve">    &lt;/p&gt;</w:t>
-      </w:r>
-    </w:p>
-    <w:p>
-      <w:r>
-        <w:t>&lt;/section&gt;</w:t>
-      </w:r>
-    </w:p>
-    <w:p/>
-    <w:p>
-      <w:r>
-        <w:t>&lt;section&gt;</w:t>
-      </w:r>
-    </w:p>
-    <w:p>
-      <w:r>
-        <w:t xml:space="preserve">    &lt;h2&gt;Horaires&lt;/h2&gt;</w:t>
-      </w:r>
-    </w:p>
-    <w:p/>
-    <w:p>
-      <w:r>
-        <w:t xml:space="preserve">    &lt;p&gt;Lundi - Samedi : 8h00 - 18h00&lt;/p&gt;</w:t>
-      </w:r>
-    </w:p>
-    <w:p>
-      <w:r>
-        <w:t xml:space="preserve">    &lt;p&gt;Dimanche : fermé&lt;/p&gt;</w:t>
-      </w:r>
-    </w:p>
-    <w:p>
-      <w:r>
-        <w:t>&lt;/section&gt;</w:t>
-      </w:r>
-    </w:p>
-    <w:p>
-      <w:r>
-        <w:t>&lt;/main&gt;</w:t>
-      </w:r>
-    </w:p>
-    <w:p>
-      <w:r>
-        <w:t>&lt;footer&gt; &lt;p&gt;© 2026 Le Petit Café&lt;/p&gt; &lt;/footer&gt;</w:t>
-      </w:r>
-    </w:p>
-    <w:p>
-      <w:r>
-        <w:t xml:space="preserve">&lt;/body&gt; </w:t>
-      </w:r>
-    </w:p>
-    <w:p>
-      <w:r>
-        <w:t>&lt;/html&gt;</w:t>
-      </w:r>
-    </w:p>
-    <w:p/>
-    <w:p>
-      <w:pPr>
-        <w:pBdr>
-          <w:top w:val="single" w:sz="4" w:space="1" w:color="auto"/>
-          <w:left w:val="single" w:sz="4" w:space="4" w:color="auto"/>
-          <w:bottom w:val="single" w:sz="4" w:space="1" w:color="auto"/>
-          <w:right w:val="single" w:sz="4" w:space="4" w:color="auto"/>
-          <w:between w:val="single" w:sz="4" w:space="1" w:color="auto"/>
-          <w:bar w:val="single" w:sz="4" w:color="auto"/>
-        </w:pBdr>
-        <w:rPr>
-          <w:b/>
-          <w:sz w:val="28"/>
-          <w:szCs w:val="28"/>
-        </w:rPr>
-      </w:pPr>
-      <w:r>
-        <w:rPr>
-          <w:sz w:val="28"/>
-          <w:szCs w:val="28"/>
-        </w:rPr>
-        <w:t xml:space="preserve">Annexe </w:t>
-      </w:r>
-      <w:r>
-        <w:rPr>
-          <w:sz w:val="28"/>
-          <w:szCs w:val="28"/>
-        </w:rPr>
-        <w:t>4</w:t>
-      </w:r>
-      <w:r>
-        <w:rPr>
-          <w:sz w:val="28"/>
-          <w:szCs w:val="28"/>
-        </w:rPr>
-        <w:t xml:space="preserve"> </w:t>
-      </w:r>
-      <w:r>
-        <w:rPr>
-          <w:sz w:val="28"/>
-          <w:szCs w:val="28"/>
-        </w:rPr>
-        <w:t xml:space="preserve">– </w:t>
-      </w:r>
-      <w:r>
-        <w:rPr>
-          <w:b/>
-          <w:sz w:val="28"/>
-          <w:szCs w:val="28"/>
-        </w:rPr>
-        <w:t>style.css (chatGPT)</w:t>
-      </w:r>
-    </w:p>
-    <w:p/>
-    <w:p>
-      <w:pPr>
-        <w:numPr>
-          <w:ilvl w:val="0"/>
-          <w:numId w:val="9"/>
-        </w:numPr>
-        <w:spacing w:before="100" w:beforeAutospacing="1" w:after="100" w:afterAutospacing="1"/>
-        <w:contextualSpacing w:val="0"/>
-        <w:jc w:val="left"/>
-        <w:rPr>
           <w:rFonts w:ascii="Times New Roman" w:hAnsi="Times New Roman" w:cs="Times New Roman"/>
           <w:sz w:val="24"/>
           <w:szCs w:val="24"/>
@@ -4115,1177 +2415,31 @@
       </w:pPr>
       <w:r>
         <w:rPr>
-          <w:rFonts w:ascii="Times New Roman" w:hAnsi="Times New Roman" w:cs="Times New Roman"/>
-          <w:sz w:val="24"/>
-          <w:szCs w:val="24"/>
-        </w:rPr>
-        <w:t>{</w:t>
-      </w:r>
-      <w:r>
-        <w:rPr>
-          <w:rFonts w:ascii="Times New Roman" w:hAnsi="Times New Roman" w:cs="Times New Roman"/>
-          <w:sz w:val="24"/>
-          <w:szCs w:val="24"/>
-        </w:rPr>
-        <w:br/>
-        <w:t>box-sizing: border-box;</w:t>
-      </w:r>
-      <w:r>
-        <w:rPr>
-          <w:rFonts w:ascii="Times New Roman" w:hAnsi="Times New Roman" w:cs="Times New Roman"/>
-          <w:sz w:val="24"/>
-          <w:szCs w:val="24"/>
-        </w:rPr>
-        <w:br/>
-        <w:t>}</w:t>
-      </w:r>
-    </w:p>
-    <w:p>
-      <w:pPr>
-        <w:spacing w:before="100" w:beforeAutospacing="1" w:after="100" w:afterAutospacing="1"/>
-        <w:contextualSpacing w:val="0"/>
-        <w:jc w:val="left"/>
-        <w:rPr>
-          <w:rFonts w:ascii="Times New Roman" w:hAnsi="Times New Roman" w:cs="Times New Roman"/>
-          <w:sz w:val="24"/>
-          <w:szCs w:val="24"/>
-        </w:rPr>
-      </w:pPr>
-      <w:r>
-        <w:rPr>
-          <w:rFonts w:ascii="Times New Roman" w:hAnsi="Times New Roman" w:cs="Times New Roman"/>
-          <w:sz w:val="24"/>
-          <w:szCs w:val="24"/>
-        </w:rPr>
-        <w:t>body {</w:t>
-      </w:r>
-      <w:r>
-        <w:rPr>
-          <w:rFonts w:ascii="Times New Roman" w:hAnsi="Times New Roman" w:cs="Times New Roman"/>
-          <w:sz w:val="24"/>
-          <w:szCs w:val="24"/>
-        </w:rPr>
-        <w:br/>
-        <w:t>margin: 0;</w:t>
-      </w:r>
-      <w:r>
-        <w:rPr>
-          <w:rFonts w:ascii="Times New Roman" w:hAnsi="Times New Roman" w:cs="Times New Roman"/>
-          <w:sz w:val="24"/>
-          <w:szCs w:val="24"/>
-        </w:rPr>
-        <w:br/>
-        <w:t>font-family: Arial, sans-serif;</w:t>
-      </w:r>
-      <w:r>
-        <w:rPr>
-          <w:rFonts w:ascii="Times New Roman" w:hAnsi="Times New Roman" w:cs="Times New Roman"/>
-          <w:sz w:val="24"/>
-          <w:szCs w:val="24"/>
-        </w:rPr>
-        <w:br/>
-        <w:t>line-height: 1.6;</w:t>
-      </w:r>
-      <w:r>
-        <w:rPr>
-          <w:rFonts w:ascii="Times New Roman" w:hAnsi="Times New Roman" w:cs="Times New Roman"/>
-          <w:sz w:val="24"/>
-          <w:szCs w:val="24"/>
-        </w:rPr>
-        <w:br/>
-        <w:t>color: #3d3028;</w:t>
-      </w:r>
-      <w:r>
-        <w:rPr>
-          <w:rFonts w:ascii="Times New Roman" w:hAnsi="Times New Roman" w:cs="Times New Roman"/>
-          <w:sz w:val="24"/>
-          <w:szCs w:val="24"/>
-        </w:rPr>
-        <w:br/>
-        <w:t>background-color: #f7f1e8;</w:t>
-      </w:r>
-      <w:r>
-        <w:rPr>
-          <w:rFonts w:ascii="Times New Roman" w:hAnsi="Times New Roman" w:cs="Times New Roman"/>
-          <w:sz w:val="24"/>
-          <w:szCs w:val="24"/>
-        </w:rPr>
-        <w:br/>
-        <w:t>}</w:t>
-      </w:r>
-    </w:p>
-    <w:p>
-      <w:pPr>
-        <w:spacing w:before="100" w:beforeAutospacing="1" w:after="100" w:afterAutospacing="1"/>
-        <w:contextualSpacing w:val="0"/>
-        <w:jc w:val="left"/>
-        <w:rPr>
-          <w:rFonts w:ascii="Times New Roman" w:hAnsi="Times New Roman" w:cs="Times New Roman"/>
-          <w:sz w:val="24"/>
-          <w:szCs w:val="24"/>
-        </w:rPr>
-      </w:pPr>
-      <w:r>
-        <w:rPr>
-          <w:rFonts w:ascii="Times New Roman" w:hAnsi="Times New Roman" w:cs="Times New Roman"/>
-          <w:sz w:val="24"/>
-          <w:szCs w:val="24"/>
-        </w:rPr>
-        <w:t>/* ---------- En-tête ---------- */</w:t>
-      </w:r>
-    </w:p>
-    <w:p>
-      <w:pPr>
-        <w:spacing w:before="100" w:beforeAutospacing="1" w:after="100" w:afterAutospacing="1"/>
-        <w:contextualSpacing w:val="0"/>
-        <w:jc w:val="left"/>
-        <w:rPr>
-          <w:rFonts w:ascii="Times New Roman" w:hAnsi="Times New Roman" w:cs="Times New Roman"/>
-          <w:sz w:val="24"/>
-          <w:szCs w:val="24"/>
-        </w:rPr>
-      </w:pPr>
-      <w:r>
-        <w:rPr>
-          <w:rFonts w:ascii="Times New Roman" w:hAnsi="Times New Roman" w:cs="Times New Roman"/>
-          <w:sz w:val="24"/>
-          <w:szCs w:val="24"/>
-        </w:rPr>
-        <w:t>header {</w:t>
-      </w:r>
-      <w:r>
-        <w:rPr>
-          <w:rFonts w:ascii="Times New Roman" w:hAnsi="Times New Roman" w:cs="Times New Roman"/>
-          <w:sz w:val="24"/>
-          <w:szCs w:val="24"/>
-        </w:rPr>
-        <w:br/>
-        <w:t>padding: 50px 20px;</w:t>
-      </w:r>
-      <w:r>
-        <w:rPr>
-          <w:rFonts w:ascii="Times New Roman" w:hAnsi="Times New Roman" w:cs="Times New Roman"/>
-          <w:sz w:val="24"/>
-          <w:szCs w:val="24"/>
-        </w:rPr>
-        <w:br/>
-        <w:t>text-align: center;</w:t>
-      </w:r>
-      <w:r>
-        <w:rPr>
-          <w:rFonts w:ascii="Times New Roman" w:hAnsi="Times New Roman" w:cs="Times New Roman"/>
-          <w:sz w:val="24"/>
-          <w:szCs w:val="24"/>
-        </w:rPr>
-        <w:br/>
-        <w:t>color: white;</w:t>
-      </w:r>
-      <w:r>
-        <w:rPr>
-          <w:rFonts w:ascii="Times New Roman" w:hAnsi="Times New Roman" w:cs="Times New Roman"/>
-          <w:sz w:val="24"/>
-          <w:szCs w:val="24"/>
-        </w:rPr>
-        <w:br/>
-        <w:t>background-color: #6f4e37;</w:t>
-      </w:r>
-      <w:r>
-        <w:rPr>
-          <w:rFonts w:ascii="Times New Roman" w:hAnsi="Times New Roman" w:cs="Times New Roman"/>
-          <w:sz w:val="24"/>
-          <w:szCs w:val="24"/>
-        </w:rPr>
-        <w:br/>
-        <w:t>}</w:t>
-      </w:r>
-    </w:p>
-    <w:p>
-      <w:pPr>
-        <w:spacing w:before="100" w:beforeAutospacing="1" w:after="100" w:afterAutospacing="1"/>
-        <w:contextualSpacing w:val="0"/>
-        <w:jc w:val="left"/>
-        <w:rPr>
-          <w:rFonts w:ascii="Times New Roman" w:hAnsi="Times New Roman" w:cs="Times New Roman"/>
-          <w:sz w:val="24"/>
-          <w:szCs w:val="24"/>
-        </w:rPr>
-      </w:pPr>
-      <w:r>
-        <w:rPr>
-          <w:rFonts w:ascii="Times New Roman" w:hAnsi="Times New Roman" w:cs="Times New Roman"/>
-          <w:sz w:val="24"/>
-          <w:szCs w:val="24"/>
-        </w:rPr>
-        <w:t>header h1 {</w:t>
-      </w:r>
-      <w:r>
-        <w:rPr>
-          <w:rFonts w:ascii="Times New Roman" w:hAnsi="Times New Roman" w:cs="Times New Roman"/>
-          <w:sz w:val="24"/>
-          <w:szCs w:val="24"/>
-        </w:rPr>
-        <w:br/>
-        <w:t>margin: 0;</w:t>
-      </w:r>
-      <w:r>
-        <w:rPr>
-          <w:rFonts w:ascii="Times New Roman" w:hAnsi="Times New Roman" w:cs="Times New Roman"/>
-          <w:sz w:val="24"/>
-          <w:szCs w:val="24"/>
-        </w:rPr>
-        <w:br/>
-        <w:t>font-size: 2.8rem;</w:t>
-      </w:r>
-      <w:r>
-        <w:rPr>
-          <w:rFonts w:ascii="Times New Roman" w:hAnsi="Times New Roman" w:cs="Times New Roman"/>
-          <w:sz w:val="24"/>
-          <w:szCs w:val="24"/>
-        </w:rPr>
-        <w:br/>
-        <w:t>}</w:t>
-      </w:r>
-    </w:p>
-    <w:p>
-      <w:pPr>
-        <w:spacing w:before="100" w:beforeAutospacing="1" w:after="100" w:afterAutospacing="1"/>
-        <w:contextualSpacing w:val="0"/>
-        <w:jc w:val="left"/>
-        <w:rPr>
-          <w:rFonts w:ascii="Times New Roman" w:hAnsi="Times New Roman" w:cs="Times New Roman"/>
-          <w:sz w:val="24"/>
-          <w:szCs w:val="24"/>
-        </w:rPr>
-      </w:pPr>
-      <w:r>
-        <w:rPr>
-          <w:rFonts w:ascii="Times New Roman" w:hAnsi="Times New Roman" w:cs="Times New Roman"/>
-          <w:sz w:val="24"/>
-          <w:szCs w:val="24"/>
-        </w:rPr>
-        <w:t>header p {</w:t>
-      </w:r>
-      <w:r>
-        <w:rPr>
-          <w:rFonts w:ascii="Times New Roman" w:hAnsi="Times New Roman" w:cs="Times New Roman"/>
-          <w:sz w:val="24"/>
-          <w:szCs w:val="24"/>
-        </w:rPr>
-        <w:br/>
-        <w:t>margin-top: 10px;</w:t>
-      </w:r>
-      <w:r>
-        <w:rPr>
-          <w:rFonts w:ascii="Times New Roman" w:hAnsi="Times New Roman" w:cs="Times New Roman"/>
-          <w:sz w:val="24"/>
-          <w:szCs w:val="24"/>
-        </w:rPr>
-        <w:br/>
-        <w:t>font-size: 1.2rem;</w:t>
-      </w:r>
-      <w:r>
-        <w:rPr>
-          <w:rFonts w:ascii="Times New Roman" w:hAnsi="Times New Roman" w:cs="Times New Roman"/>
-          <w:sz w:val="24"/>
-          <w:szCs w:val="24"/>
-        </w:rPr>
-        <w:br/>
-        <w:t>}</w:t>
-      </w:r>
-    </w:p>
-    <w:p>
-      <w:pPr>
-        <w:spacing w:before="100" w:beforeAutospacing="1" w:after="100" w:afterAutospacing="1"/>
-        <w:contextualSpacing w:val="0"/>
-        <w:jc w:val="left"/>
-        <w:rPr>
-          <w:rFonts w:ascii="Times New Roman" w:hAnsi="Times New Roman" w:cs="Times New Roman"/>
-          <w:sz w:val="24"/>
-          <w:szCs w:val="24"/>
-        </w:rPr>
-      </w:pPr>
-      <w:r>
-        <w:rPr>
-          <w:rFonts w:ascii="Times New Roman" w:hAnsi="Times New Roman" w:cs="Times New Roman"/>
-          <w:sz w:val="24"/>
-          <w:szCs w:val="24"/>
-        </w:rPr>
-        <w:t>/* ---------- Navigation ---------- */</w:t>
-      </w:r>
-    </w:p>
-    <w:p>
-      <w:pPr>
-        <w:spacing w:before="100" w:beforeAutospacing="1" w:after="100" w:afterAutospacing="1"/>
-        <w:contextualSpacing w:val="0"/>
-        <w:jc w:val="left"/>
-        <w:rPr>
-          <w:rFonts w:ascii="Times New Roman" w:hAnsi="Times New Roman" w:cs="Times New Roman"/>
-          <w:sz w:val="24"/>
-          <w:szCs w:val="24"/>
-        </w:rPr>
-      </w:pPr>
-      <w:r>
-        <w:rPr>
-          <w:rFonts w:ascii="Times New Roman" w:hAnsi="Times New Roman" w:cs="Times New Roman"/>
-          <w:sz w:val="24"/>
-          <w:szCs w:val="24"/>
-        </w:rPr>
-        <w:t>nav {</w:t>
-      </w:r>
-      <w:r>
-        <w:rPr>
-          <w:rFonts w:ascii="Times New Roman" w:hAnsi="Times New Roman" w:cs="Times New Roman"/>
-          <w:sz w:val="24"/>
-          <w:szCs w:val="24"/>
-        </w:rPr>
-        <w:br/>
-        <w:t>padding: 15px;</w:t>
-      </w:r>
-      <w:r>
-        <w:rPr>
-          <w:rFonts w:ascii="Times New Roman" w:hAnsi="Times New Roman" w:cs="Times New Roman"/>
-          <w:sz w:val="24"/>
-          <w:szCs w:val="24"/>
-        </w:rPr>
-        <w:br/>
-        <w:t>text-align: center;</w:t>
-      </w:r>
-      <w:r>
-        <w:rPr>
-          <w:rFonts w:ascii="Times New Roman" w:hAnsi="Times New Roman" w:cs="Times New Roman"/>
-          <w:sz w:val="24"/>
-          <w:szCs w:val="24"/>
-        </w:rPr>
-        <w:br/>
-        <w:t>background-color: #3f2b1f;</w:t>
-      </w:r>
-      <w:r>
-        <w:rPr>
-          <w:rFonts w:ascii="Times New Roman" w:hAnsi="Times New Roman" w:cs="Times New Roman"/>
-          <w:sz w:val="24"/>
-          <w:szCs w:val="24"/>
-        </w:rPr>
-        <w:br/>
-        <w:t>}</w:t>
-      </w:r>
-    </w:p>
-    <w:p>
-      <w:pPr>
-        <w:spacing w:before="100" w:beforeAutospacing="1" w:after="100" w:afterAutospacing="1"/>
-        <w:contextualSpacing w:val="0"/>
-        <w:jc w:val="left"/>
-        <w:rPr>
-          <w:rFonts w:ascii="Times New Roman" w:hAnsi="Times New Roman" w:cs="Times New Roman"/>
-          <w:sz w:val="24"/>
-          <w:szCs w:val="24"/>
-        </w:rPr>
-      </w:pPr>
-      <w:r>
-        <w:rPr>
-          <w:rFonts w:ascii="Times New Roman" w:hAnsi="Times New Roman" w:cs="Times New Roman"/>
-          <w:sz w:val="24"/>
-          <w:szCs w:val="24"/>
-        </w:rPr>
-        <w:t>nav a {</w:t>
-      </w:r>
-      <w:r>
-        <w:rPr>
-          <w:rFonts w:ascii="Times New Roman" w:hAnsi="Times New Roman" w:cs="Times New Roman"/>
-          <w:sz w:val="24"/>
-          <w:szCs w:val="24"/>
-        </w:rPr>
-        <w:br/>
-        <w:t>margin: 0 15px;</w:t>
-      </w:r>
-      <w:r>
-        <w:rPr>
-          <w:rFonts w:ascii="Times New Roman" w:hAnsi="Times New Roman" w:cs="Times New Roman"/>
-          <w:sz w:val="24"/>
-          <w:szCs w:val="24"/>
-        </w:rPr>
-        <w:br/>
-        <w:t>color: white;</w:t>
-      </w:r>
-      <w:r>
-        <w:rPr>
-          <w:rFonts w:ascii="Times New Roman" w:hAnsi="Times New Roman" w:cs="Times New Roman"/>
-          <w:sz w:val="24"/>
-          <w:szCs w:val="24"/>
-        </w:rPr>
-        <w:br/>
-        <w:t>text-decoration: none;</w:t>
-      </w:r>
-      <w:r>
-        <w:rPr>
-          <w:rFonts w:ascii="Times New Roman" w:hAnsi="Times New Roman" w:cs="Times New Roman"/>
-          <w:sz w:val="24"/>
-          <w:szCs w:val="24"/>
-        </w:rPr>
-        <w:br/>
-        <w:t>font-weight: bold;</w:t>
-      </w:r>
-      <w:r>
-        <w:rPr>
-          <w:rFonts w:ascii="Times New Roman" w:hAnsi="Times New Roman" w:cs="Times New Roman"/>
-          <w:sz w:val="24"/>
-          <w:szCs w:val="24"/>
-        </w:rPr>
-        <w:br/>
-        <w:t>}</w:t>
-      </w:r>
-    </w:p>
-    <w:p>
-      <w:pPr>
-        <w:spacing w:before="100" w:beforeAutospacing="1" w:after="100" w:afterAutospacing="1"/>
-        <w:contextualSpacing w:val="0"/>
-        <w:jc w:val="left"/>
-        <w:rPr>
-          <w:rFonts w:ascii="Times New Roman" w:hAnsi="Times New Roman" w:cs="Times New Roman"/>
-          <w:sz w:val="24"/>
-          <w:szCs w:val="24"/>
-        </w:rPr>
-      </w:pPr>
-      <w:r>
-        <w:rPr>
-          <w:rFonts w:ascii="Times New Roman" w:hAnsi="Times New Roman" w:cs="Times New Roman"/>
-          <w:sz w:val="24"/>
-          <w:szCs w:val="24"/>
-        </w:rPr>
-        <w:t>nav a {</w:t>
-      </w:r>
-      <w:r>
-        <w:rPr>
-          <w:rFonts w:ascii="Times New Roman" w:hAnsi="Times New Roman" w:cs="Times New Roman"/>
-          <w:sz w:val="24"/>
-          <w:szCs w:val="24"/>
-        </w:rPr>
-        <w:br/>
-        <w:t>color: #f0c987;</w:t>
-      </w:r>
-      <w:r>
-        <w:rPr>
-          <w:rFonts w:ascii="Times New Roman" w:hAnsi="Times New Roman" w:cs="Times New Roman"/>
-          <w:sz w:val="24"/>
-          <w:szCs w:val="24"/>
-        </w:rPr>
-        <w:br/>
-        <w:t>}</w:t>
-      </w:r>
-    </w:p>
-    <w:p>
-      <w:pPr>
-        <w:spacing w:before="100" w:beforeAutospacing="1" w:after="100" w:afterAutospacing="1"/>
-        <w:contextualSpacing w:val="0"/>
-        <w:jc w:val="left"/>
-        <w:rPr>
-          <w:rFonts w:ascii="Times New Roman" w:hAnsi="Times New Roman" w:cs="Times New Roman"/>
-          <w:sz w:val="24"/>
-          <w:szCs w:val="24"/>
-        </w:rPr>
-      </w:pPr>
-      <w:r>
-        <w:rPr>
-          <w:rFonts w:ascii="Times New Roman" w:hAnsi="Times New Roman" w:cs="Times New Roman"/>
-          <w:sz w:val="24"/>
-          <w:szCs w:val="24"/>
-        </w:rPr>
-        <w:t>/* ---------- Contenu ---------- */</w:t>
-      </w:r>
-    </w:p>
-    <w:p>
-      <w:pPr>
-        <w:spacing w:before="100" w:beforeAutospacing="1" w:after="100" w:afterAutospacing="1"/>
-        <w:contextualSpacing w:val="0"/>
-        <w:jc w:val="left"/>
-        <w:rPr>
-          <w:rFonts w:ascii="Times New Roman" w:hAnsi="Times New Roman" w:cs="Times New Roman"/>
-          <w:sz w:val="24"/>
-          <w:szCs w:val="24"/>
-        </w:rPr>
-      </w:pPr>
-      <w:r>
-        <w:rPr>
-          <w:rFonts w:ascii="Times New Roman" w:hAnsi="Times New Roman" w:cs="Times New Roman"/>
-          <w:sz w:val="24"/>
-          <w:szCs w:val="24"/>
-        </w:rPr>
-        <w:t>main {</w:t>
-      </w:r>
-      <w:r>
-        <w:rPr>
-          <w:rFonts w:ascii="Times New Roman" w:hAnsi="Times New Roman" w:cs="Times New Roman"/>
-          <w:sz w:val="24"/>
-          <w:szCs w:val="24"/>
-        </w:rPr>
-        <w:br/>
-        <w:t>width: 90%;</w:t>
-      </w:r>
-      <w:r>
-        <w:rPr>
-          <w:rFonts w:ascii="Times New Roman" w:hAnsi="Times New Roman" w:cs="Times New Roman"/>
-          <w:sz w:val="24"/>
-          <w:szCs w:val="24"/>
-        </w:rPr>
-        <w:br/>
-        <w:t>max-width: 900px;</w:t>
-      </w:r>
-      <w:r>
-        <w:rPr>
-          <w:rFonts w:ascii="Times New Roman" w:hAnsi="Times New Roman" w:cs="Times New Roman"/>
-          <w:sz w:val="24"/>
-          <w:szCs w:val="24"/>
-        </w:rPr>
-        <w:br/>
-        <w:t>margin: 30px auto;</w:t>
-      </w:r>
-      <w:r>
-        <w:rPr>
-          <w:rFonts w:ascii="Times New Roman" w:hAnsi="Times New Roman" w:cs="Times New Roman"/>
-          <w:sz w:val="24"/>
-          <w:szCs w:val="24"/>
-        </w:rPr>
-        <w:br/>
-        <w:t>}</w:t>
-      </w:r>
-    </w:p>
-    <w:p>
-      <w:pPr>
-        <w:spacing w:before="100" w:beforeAutospacing="1" w:after="100" w:afterAutospacing="1"/>
-        <w:contextualSpacing w:val="0"/>
-        <w:jc w:val="left"/>
-        <w:rPr>
-          <w:rFonts w:ascii="Times New Roman" w:hAnsi="Times New Roman" w:cs="Times New Roman"/>
-          <w:sz w:val="24"/>
-          <w:szCs w:val="24"/>
-        </w:rPr>
-      </w:pPr>
-      <w:r>
-        <w:rPr>
-          <w:rFonts w:ascii="Times New Roman" w:hAnsi="Times New Roman" w:cs="Times New Roman"/>
-          <w:sz w:val="24"/>
-          <w:szCs w:val="24"/>
-        </w:rPr>
-        <w:t>section {</w:t>
-      </w:r>
-      <w:r>
-        <w:rPr>
-          <w:rFonts w:ascii="Times New Roman" w:hAnsi="Times New Roman" w:cs="Times New Roman"/>
-          <w:sz w:val="24"/>
-          <w:szCs w:val="24"/>
-        </w:rPr>
-        <w:br/>
-        <w:t>margin-bottom: 25px;</w:t>
-      </w:r>
-      <w:r>
-        <w:rPr>
-          <w:rFonts w:ascii="Times New Roman" w:hAnsi="Times New Roman" w:cs="Times New Roman"/>
-          <w:sz w:val="24"/>
-          <w:szCs w:val="24"/>
-        </w:rPr>
-        <w:br/>
-        <w:t>padding: 30px;</w:t>
-      </w:r>
-      <w:r>
-        <w:rPr>
-          <w:rFonts w:ascii="Times New Roman" w:hAnsi="Times New Roman" w:cs="Times New Roman"/>
-          <w:sz w:val="24"/>
-          <w:szCs w:val="24"/>
-        </w:rPr>
-        <w:br/>
-        <w:t>background-color: white;</w:t>
-      </w:r>
-      <w:r>
-        <w:rPr>
-          <w:rFonts w:ascii="Times New Roman" w:hAnsi="Times New Roman" w:cs="Times New Roman"/>
-          <w:sz w:val="24"/>
-          <w:szCs w:val="24"/>
-        </w:rPr>
-        <w:br/>
-        <w:t>border-radius: 10px;</w:t>
-      </w:r>
-      <w:r>
-        <w:rPr>
-          <w:rFonts w:ascii="Times New Roman" w:hAnsi="Times New Roman" w:cs="Times New Roman"/>
-          <w:sz w:val="24"/>
-          <w:szCs w:val="24"/>
-        </w:rPr>
-        <w:br/>
-        <w:t>box-shadow: 0 2px 8px rgba(0, 0, 0, 0.08);</w:t>
-      </w:r>
-      <w:r>
-        <w:rPr>
-          <w:rFonts w:ascii="Times New Roman" w:hAnsi="Times New Roman" w:cs="Times New Roman"/>
-          <w:sz w:val="24"/>
-          <w:szCs w:val="24"/>
-        </w:rPr>
-        <w:br/>
-        <w:t>}</w:t>
-      </w:r>
-    </w:p>
-    <w:p>
-      <w:pPr>
-        <w:spacing w:before="100" w:beforeAutospacing="1" w:after="100" w:afterAutospacing="1"/>
-        <w:contextualSpacing w:val="0"/>
-        <w:jc w:val="left"/>
-        <w:rPr>
-          <w:rFonts w:ascii="Times New Roman" w:hAnsi="Times New Roman" w:cs="Times New Roman"/>
-          <w:sz w:val="24"/>
-          <w:szCs w:val="24"/>
-        </w:rPr>
-      </w:pPr>
-      <w:r>
-        <w:rPr>
-          <w:rFonts w:ascii="Times New Roman" w:hAnsi="Times New Roman" w:cs="Times New Roman"/>
-          <w:sz w:val="24"/>
-          <w:szCs w:val="24"/>
-        </w:rPr>
-        <w:t>section h2 {</w:t>
-      </w:r>
-      <w:r>
-        <w:rPr>
-          <w:rFonts w:ascii="Times New Roman" w:hAnsi="Times New Roman" w:cs="Times New Roman"/>
-          <w:sz w:val="24"/>
-          <w:szCs w:val="24"/>
-        </w:rPr>
-        <w:br/>
-        <w:t>margin-top: 0;</w:t>
-      </w:r>
-      <w:r>
-        <w:rPr>
-          <w:rFonts w:ascii="Times New Roman" w:hAnsi="Times New Roman" w:cs="Times New Roman"/>
-          <w:sz w:val="24"/>
-          <w:szCs w:val="24"/>
-        </w:rPr>
-        <w:br/>
-        <w:t>color: #6f4e37;</w:t>
-      </w:r>
-      <w:r>
-        <w:rPr>
-          <w:rFonts w:ascii="Times New Roman" w:hAnsi="Times New Roman" w:cs="Times New Roman"/>
-          <w:sz w:val="24"/>
-          <w:szCs w:val="24"/>
-        </w:rPr>
-        <w:br/>
-        <w:t>}</w:t>
-      </w:r>
-    </w:p>
-    <w:p>
-      <w:pPr>
-        <w:spacing w:before="100" w:beforeAutospacing="1" w:after="100" w:afterAutospacing="1"/>
-        <w:contextualSpacing w:val="0"/>
-        <w:jc w:val="left"/>
-        <w:rPr>
-          <w:rFonts w:ascii="Times New Roman" w:hAnsi="Times New Roman" w:cs="Times New Roman"/>
-          <w:sz w:val="24"/>
-          <w:szCs w:val="24"/>
-        </w:rPr>
-      </w:pPr>
-      <w:r>
-        <w:rPr>
-          <w:rFonts w:ascii="Times New Roman" w:hAnsi="Times New Roman" w:cs="Times New Roman"/>
-          <w:sz w:val="24"/>
-          <w:szCs w:val="24"/>
-        </w:rPr>
-        <w:t>/* ---------- Accueil ---------- */</w:t>
-      </w:r>
-    </w:p>
-    <w:p>
-      <w:pPr>
-        <w:spacing w:before="100" w:beforeAutospacing="1" w:after="100" w:afterAutospacing="1"/>
-        <w:contextualSpacing w:val="0"/>
-        <w:jc w:val="left"/>
-        <w:rPr>
-          <w:rFonts w:ascii="Times New Roman" w:hAnsi="Times New Roman" w:cs="Times New Roman"/>
-          <w:sz w:val="24"/>
-          <w:szCs w:val="24"/>
-        </w:rPr>
-      </w:pPr>
-      <w:r>
-        <w:rPr>
-          <w:rFonts w:ascii="Times New Roman" w:hAnsi="Times New Roman" w:cs="Times New Roman"/>
-          <w:sz w:val="24"/>
-          <w:szCs w:val="24"/>
-        </w:rPr>
-        <w:t>.hero {</w:t>
-      </w:r>
-      <w:r>
-        <w:rPr>
-          <w:rFonts w:ascii="Times New Roman" w:hAnsi="Times New Roman" w:cs="Times New Roman"/>
-          <w:sz w:val="24"/>
-          <w:szCs w:val="24"/>
-        </w:rPr>
-        <w:br/>
-        <w:t>text-align: center;</w:t>
-      </w:r>
-      <w:r>
-        <w:rPr>
-          <w:rFonts w:ascii="Times New Roman" w:hAnsi="Times New Roman" w:cs="Times New Roman"/>
-          <w:sz w:val="24"/>
-          <w:szCs w:val="24"/>
-        </w:rPr>
-        <w:br/>
-        <w:t>}</w:t>
-      </w:r>
-    </w:p>
-    <w:p>
-      <w:pPr>
-        <w:spacing w:before="100" w:beforeAutospacing="1" w:after="100" w:afterAutospacing="1"/>
-        <w:contextualSpacing w:val="0"/>
-        <w:jc w:val="left"/>
-        <w:rPr>
-          <w:rFonts w:ascii="Times New Roman" w:hAnsi="Times New Roman" w:cs="Times New Roman"/>
-          <w:sz w:val="24"/>
-          <w:szCs w:val="24"/>
-        </w:rPr>
-      </w:pPr>
-      <w:r>
-        <w:rPr>
-          <w:rFonts w:ascii="Times New Roman" w:hAnsi="Times New Roman" w:cs="Times New Roman"/>
-          <w:sz w:val="24"/>
-          <w:szCs w:val="24"/>
-        </w:rPr>
-        <w:t>.button {</w:t>
-      </w:r>
-      <w:r>
-        <w:rPr>
-          <w:rFonts w:ascii="Times New Roman" w:hAnsi="Times New Roman" w:cs="Times New Roman"/>
-          <w:sz w:val="24"/>
-          <w:szCs w:val="24"/>
-        </w:rPr>
-        <w:br/>
-        <w:t>display: inline-block;</w:t>
-      </w:r>
-      <w:r>
-        <w:rPr>
-          <w:rFonts w:ascii="Times New Roman" w:hAnsi="Times New Roman" w:cs="Times New Roman"/>
-          <w:sz w:val="24"/>
-          <w:szCs w:val="24"/>
-        </w:rPr>
-        <w:br/>
-        <w:t>margin-top: 15px;</w:t>
-      </w:r>
-      <w:r>
-        <w:rPr>
-          <w:rFonts w:ascii="Times New Roman" w:hAnsi="Times New Roman" w:cs="Times New Roman"/>
-          <w:sz w:val="24"/>
-          <w:szCs w:val="24"/>
-        </w:rPr>
-        <w:br/>
-        <w:t>padding: 10px 20px;</w:t>
-      </w:r>
-      <w:r>
-        <w:rPr>
-          <w:rFonts w:ascii="Times New Roman" w:hAnsi="Times New Roman" w:cs="Times New Roman"/>
-          <w:sz w:val="24"/>
-          <w:szCs w:val="24"/>
-        </w:rPr>
-        <w:br/>
-        <w:t>color: white;</w:t>
-      </w:r>
-      <w:r>
-        <w:rPr>
-          <w:rFonts w:ascii="Times New Roman" w:hAnsi="Times New Roman" w:cs="Times New Roman"/>
-          <w:sz w:val="24"/>
-          <w:szCs w:val="24"/>
-        </w:rPr>
-        <w:br/>
-        <w:t>background-color: #6f4e37;</w:t>
-      </w:r>
-      <w:r>
-        <w:rPr>
-          <w:rFonts w:ascii="Times New Roman" w:hAnsi="Times New Roman" w:cs="Times New Roman"/>
-          <w:sz w:val="24"/>
-          <w:szCs w:val="24"/>
-        </w:rPr>
-        <w:br/>
-        <w:t>border-radius: 5px;</w:t>
-      </w:r>
-      <w:r>
-        <w:rPr>
-          <w:rFonts w:ascii="Times New Roman" w:hAnsi="Times New Roman" w:cs="Times New Roman"/>
-          <w:sz w:val="24"/>
-          <w:szCs w:val="24"/>
-        </w:rPr>
-        <w:br/>
-        <w:t>text-decoration: none;</w:t>
-      </w:r>
-      <w:r>
-        <w:rPr>
-          <w:rFonts w:ascii="Times New Roman" w:hAnsi="Times New Roman" w:cs="Times New Roman"/>
-          <w:sz w:val="24"/>
-          <w:szCs w:val="24"/>
-        </w:rPr>
-        <w:br/>
-        <w:t>}</w:t>
-      </w:r>
-    </w:p>
-    <w:p>
-      <w:pPr>
-        <w:spacing w:before="100" w:beforeAutospacing="1" w:after="100" w:afterAutospacing="1"/>
-        <w:contextualSpacing w:val="0"/>
-        <w:jc w:val="left"/>
-        <w:rPr>
-          <w:rFonts w:ascii="Times New Roman" w:hAnsi="Times New Roman" w:cs="Times New Roman"/>
-          <w:sz w:val="24"/>
-          <w:szCs w:val="24"/>
-        </w:rPr>
-      </w:pPr>
-      <w:r>
-        <w:rPr>
-          <w:rFonts w:ascii="Times New Roman" w:hAnsi="Times New Roman" w:cs="Times New Roman"/>
-          <w:sz w:val="24"/>
-          <w:szCs w:val="24"/>
-        </w:rPr>
-        <w:t>.button {</w:t>
-      </w:r>
-      <w:r>
-        <w:rPr>
-          <w:rFonts w:ascii="Times New Roman" w:hAnsi="Times New Roman" w:cs="Times New Roman"/>
-          <w:sz w:val="24"/>
-          <w:szCs w:val="24"/>
-        </w:rPr>
-        <w:br/>
-        <w:t>background-color: #3f2b1f;</w:t>
-      </w:r>
-      <w:r>
-        <w:rPr>
-          <w:rFonts w:ascii="Times New Roman" w:hAnsi="Times New Roman" w:cs="Times New Roman"/>
-          <w:sz w:val="24"/>
-          <w:szCs w:val="24"/>
-        </w:rPr>
-        <w:br/>
-        <w:t>}</w:t>
-      </w:r>
-    </w:p>
-    <w:p>
-      <w:pPr>
-        <w:spacing w:before="100" w:beforeAutospacing="1" w:after="100" w:afterAutospacing="1"/>
-        <w:contextualSpacing w:val="0"/>
-        <w:jc w:val="left"/>
-        <w:rPr>
-          <w:rFonts w:ascii="Times New Roman" w:hAnsi="Times New Roman" w:cs="Times New Roman"/>
-          <w:sz w:val="24"/>
-          <w:szCs w:val="24"/>
-        </w:rPr>
-      </w:pPr>
-      <w:r>
-        <w:rPr>
-          <w:rFonts w:ascii="Times New Roman" w:hAnsi="Times New Roman" w:cs="Times New Roman"/>
-          <w:sz w:val="24"/>
-          <w:szCs w:val="24"/>
-        </w:rPr>
-        <w:t>/* ---------- Menu ---------- */</w:t>
-      </w:r>
-    </w:p>
-    <w:p>
-      <w:pPr>
-        <w:spacing w:before="100" w:beforeAutospacing="1" w:after="100" w:afterAutospacing="1"/>
-        <w:contextualSpacing w:val="0"/>
-        <w:jc w:val="left"/>
-        <w:rPr>
-          <w:rFonts w:ascii="Times New Roman" w:hAnsi="Times New Roman" w:cs="Times New Roman"/>
-          <w:sz w:val="24"/>
-          <w:szCs w:val="24"/>
-        </w:rPr>
-      </w:pPr>
-      <w:r>
-        <w:rPr>
-          <w:rFonts w:ascii="Times New Roman" w:hAnsi="Times New Roman" w:cs="Times New Roman"/>
-          <w:sz w:val="24"/>
-          <w:szCs w:val="24"/>
-        </w:rPr>
-        <w:t>.menu-item {</w:t>
-      </w:r>
-      <w:r>
-        <w:rPr>
-          <w:rFonts w:ascii="Times New Roman" w:hAnsi="Times New Roman" w:cs="Times New Roman"/>
-          <w:sz w:val="24"/>
-          <w:szCs w:val="24"/>
-        </w:rPr>
-        <w:br/>
-        <w:t>padding: 15px 0;</w:t>
-      </w:r>
-      <w:r>
-        <w:rPr>
-          <w:rFonts w:ascii="Times New Roman" w:hAnsi="Times New Roman" w:cs="Times New Roman"/>
-          <w:sz w:val="24"/>
-          <w:szCs w:val="24"/>
-        </w:rPr>
-        <w:br/>
-        <w:t>border-bottom: 1px solid #ddd;</w:t>
-      </w:r>
-      <w:r>
-        <w:rPr>
-          <w:rFonts w:ascii="Times New Roman" w:hAnsi="Times New Roman" w:cs="Times New Roman"/>
-          <w:sz w:val="24"/>
-          <w:szCs w:val="24"/>
-        </w:rPr>
-        <w:br/>
-        <w:t>}</w:t>
-      </w:r>
-    </w:p>
-    <w:p>
-      <w:pPr>
-        <w:spacing w:before="100" w:beforeAutospacing="1" w:after="100" w:afterAutospacing="1"/>
-        <w:contextualSpacing w:val="0"/>
-        <w:jc w:val="left"/>
-        <w:rPr>
-          <w:rFonts w:ascii="Times New Roman" w:hAnsi="Times New Roman" w:cs="Times New Roman"/>
-          <w:sz w:val="24"/>
-          <w:szCs w:val="24"/>
-        </w:rPr>
-      </w:pPr>
-      <w:r>
-        <w:rPr>
-          <w:rFonts w:ascii="Times New Roman" w:hAnsi="Times New Roman" w:cs="Times New Roman"/>
-          <w:sz w:val="24"/>
-          <w:szCs w:val="24"/>
-        </w:rPr>
-        <w:t>.menu-item {</w:t>
-      </w:r>
-      <w:r>
-        <w:rPr>
-          <w:rFonts w:ascii="Times New Roman" w:hAnsi="Times New Roman" w:cs="Times New Roman"/>
-          <w:sz w:val="24"/>
-          <w:szCs w:val="24"/>
-        </w:rPr>
-        <w:br/>
-        <w:t>border-bottom: none;</w:t>
-      </w:r>
-      <w:r>
-        <w:rPr>
-          <w:rFonts w:ascii="Times New Roman" w:hAnsi="Times New Roman" w:cs="Times New Roman"/>
-          <w:sz w:val="24"/>
-          <w:szCs w:val="24"/>
-        </w:rPr>
-        <w:br/>
-        <w:t>}</w:t>
-      </w:r>
-    </w:p>
-    <w:p>
-      <w:pPr>
-        <w:spacing w:before="100" w:beforeAutospacing="1" w:after="100" w:afterAutospacing="1"/>
-        <w:contextualSpacing w:val="0"/>
-        <w:jc w:val="left"/>
-        <w:rPr>
-          <w:rFonts w:ascii="Times New Roman" w:hAnsi="Times New Roman" w:cs="Times New Roman"/>
-          <w:sz w:val="24"/>
-          <w:szCs w:val="24"/>
-        </w:rPr>
-      </w:pPr>
-      <w:r>
-        <w:rPr>
-          <w:rFonts w:ascii="Times New Roman" w:hAnsi="Times New Roman" w:cs="Times New Roman"/>
-          <w:sz w:val="24"/>
-          <w:szCs w:val="24"/>
-        </w:rPr>
-        <w:t>.menu-item h3 {</w:t>
-      </w:r>
-      <w:r>
-        <w:rPr>
-          <w:rFonts w:ascii="Times New Roman" w:hAnsi="Times New Roman" w:cs="Times New Roman"/>
-          <w:sz w:val="24"/>
-          <w:szCs w:val="24"/>
-        </w:rPr>
-        <w:br/>
-        <w:t>margin-bottom: 5px;</w:t>
-      </w:r>
-      <w:r>
-        <w:rPr>
-          <w:rFonts w:ascii="Times New Roman" w:hAnsi="Times New Roman" w:cs="Times New Roman"/>
-          <w:sz w:val="24"/>
-          <w:szCs w:val="24"/>
-        </w:rPr>
-        <w:br/>
-        <w:t>color: #6f4e37;</w:t>
-      </w:r>
-      <w:r>
-        <w:rPr>
-          <w:rFonts w:ascii="Times New Roman" w:hAnsi="Times New Roman" w:cs="Times New Roman"/>
-          <w:sz w:val="24"/>
-          <w:szCs w:val="24"/>
-        </w:rPr>
-        <w:br/>
-        <w:t>}</w:t>
-      </w:r>
-    </w:p>
-    <w:p>
-      <w:pPr>
-        <w:spacing w:before="100" w:beforeAutospacing="1" w:after="100" w:afterAutospacing="1"/>
-        <w:contextualSpacing w:val="0"/>
-        <w:jc w:val="left"/>
-        <w:rPr>
-          <w:rFonts w:ascii="Times New Roman" w:hAnsi="Times New Roman" w:cs="Times New Roman"/>
-          <w:sz w:val="24"/>
-          <w:szCs w:val="24"/>
-        </w:rPr>
-      </w:pPr>
-      <w:r>
-        <w:rPr>
-          <w:rFonts w:ascii="Times New Roman" w:hAnsi="Times New Roman" w:cs="Times New Roman"/>
-          <w:sz w:val="24"/>
-          <w:szCs w:val="24"/>
-        </w:rPr>
-        <w:t>.menu-item p {</w:t>
-      </w:r>
-      <w:r>
-        <w:rPr>
-          <w:rFonts w:ascii="Times New Roman" w:hAnsi="Times New Roman" w:cs="Times New Roman"/>
-          <w:sz w:val="24"/>
-          <w:szCs w:val="24"/>
-        </w:rPr>
-        <w:br/>
-        <w:t>display: inline;</w:t>
-      </w:r>
-      <w:r>
-        <w:rPr>
-          <w:rFonts w:ascii="Times New Roman" w:hAnsi="Times New Roman" w:cs="Times New Roman"/>
-          <w:sz w:val="24"/>
-          <w:szCs w:val="24"/>
-        </w:rPr>
-        <w:br/>
-        <w:t>}</w:t>
-      </w:r>
-    </w:p>
-    <w:p>
-      <w:pPr>
-        <w:spacing w:before="100" w:beforeAutospacing="1" w:after="100" w:afterAutospacing="1"/>
-        <w:contextualSpacing w:val="0"/>
-        <w:jc w:val="left"/>
-        <w:rPr>
-          <w:rFonts w:ascii="Times New Roman" w:hAnsi="Times New Roman" w:cs="Times New Roman"/>
-          <w:sz w:val="24"/>
-          <w:szCs w:val="24"/>
-        </w:rPr>
-      </w:pPr>
-      <w:r>
-        <w:rPr>
-          <w:rFonts w:ascii="Times New Roman" w:hAnsi="Times New Roman" w:cs="Times New Roman"/>
-          <w:sz w:val="24"/>
-          <w:szCs w:val="24"/>
-        </w:rPr>
-        <w:t>.menu-item strong {</w:t>
-      </w:r>
-      <w:r>
-        <w:rPr>
-          <w:rFonts w:ascii="Times New Roman" w:hAnsi="Times New Roman" w:cs="Times New Roman"/>
-          <w:sz w:val="24"/>
-          <w:szCs w:val="24"/>
-        </w:rPr>
-        <w:br/>
-        <w:t>float: right;</w:t>
-      </w:r>
-      <w:r>
-        <w:rPr>
-          <w:rFonts w:ascii="Times New Roman" w:hAnsi="Times New Roman" w:cs="Times New Roman"/>
-          <w:sz w:val="24"/>
-          <w:szCs w:val="24"/>
-        </w:rPr>
-        <w:br/>
-        <w:t>color: #6f4e37;</w:t>
-      </w:r>
-      <w:r>
-        <w:rPr>
-          <w:rFonts w:ascii="Times New Roman" w:hAnsi="Times New Roman" w:cs="Times New Roman"/>
-          <w:sz w:val="24"/>
-          <w:szCs w:val="24"/>
-        </w:rPr>
-        <w:br/>
-        <w:t>}</w:t>
-      </w:r>
-    </w:p>
-    <w:p>
-      <w:pPr>
-        <w:spacing w:before="100" w:beforeAutospacing="1" w:after="100" w:afterAutospacing="1"/>
-        <w:contextualSpacing w:val="0"/>
-        <w:jc w:val="left"/>
-        <w:rPr>
-          <w:rFonts w:ascii="Times New Roman" w:hAnsi="Times New Roman" w:cs="Times New Roman"/>
-          <w:sz w:val="24"/>
-          <w:szCs w:val="24"/>
-        </w:rPr>
-      </w:pPr>
-      <w:r>
-        <w:rPr>
-          <w:rFonts w:ascii="Times New Roman" w:hAnsi="Times New Roman" w:cs="Times New Roman"/>
-          <w:sz w:val="24"/>
-          <w:szCs w:val="24"/>
-        </w:rPr>
-        <w:t>/* ---------- Pied de page ---------- */</w:t>
-      </w:r>
-    </w:p>
-    <w:p>
-      <w:pPr>
-        <w:spacing w:before="100" w:beforeAutospacing="1" w:after="100" w:afterAutospacing="1"/>
-        <w:contextualSpacing w:val="0"/>
-        <w:jc w:val="left"/>
-        <w:rPr>
-          <w:rFonts w:ascii="Times New Roman" w:hAnsi="Times New Roman" w:cs="Times New Roman"/>
-          <w:sz w:val="24"/>
-          <w:szCs w:val="24"/>
-        </w:rPr>
-      </w:pPr>
-      <w:r>
-        <w:rPr>
-          <w:rFonts w:ascii="Times New Roman" w:hAnsi="Times New Roman" w:cs="Times New Roman"/>
-          <w:sz w:val="24"/>
-          <w:szCs w:val="24"/>
-        </w:rPr>
-        <w:t>footer {</w:t>
-      </w:r>
-      <w:r>
-        <w:rPr>
-          <w:rFonts w:ascii="Times New Roman" w:hAnsi="Times New Roman" w:cs="Times New Roman"/>
-          <w:sz w:val="24"/>
-          <w:szCs w:val="24"/>
-        </w:rPr>
-        <w:br/>
-        <w:t>margin-top: 50px;</w:t>
-      </w:r>
-      <w:r>
-        <w:rPr>
-          <w:rFonts w:ascii="Times New Roman" w:hAnsi="Times New Roman" w:cs="Times New Roman"/>
-          <w:sz w:val="24"/>
-          <w:szCs w:val="24"/>
-        </w:rPr>
-        <w:br/>
-        <w:t>padding: 25px;</w:t>
-      </w:r>
-      <w:r>
-        <w:rPr>
-          <w:rFonts w:ascii="Times New Roman" w:hAnsi="Times New Roman" w:cs="Times New Roman"/>
-          <w:sz w:val="24"/>
-          <w:szCs w:val="24"/>
-        </w:rPr>
-        <w:br/>
-        <w:t>text-align: center;</w:t>
-      </w:r>
-      <w:r>
-        <w:rPr>
-          <w:rFonts w:ascii="Times New Roman" w:hAnsi="Times New Roman" w:cs="Times New Roman"/>
-          <w:sz w:val="24"/>
-          <w:szCs w:val="24"/>
-        </w:rPr>
-        <w:br/>
-        <w:t>color: white;</w:t>
-      </w:r>
-      <w:r>
-        <w:rPr>
-          <w:rFonts w:ascii="Times New Roman" w:hAnsi="Times New Roman" w:cs="Times New Roman"/>
-          <w:sz w:val="24"/>
-          <w:szCs w:val="24"/>
-        </w:rPr>
-        <w:br/>
-        <w:t>background-color: #3f2b1f;</w:t>
-      </w:r>
-      <w:r>
-        <w:rPr>
-          <w:rFonts w:ascii="Times New Roman" w:hAnsi="Times New Roman" w:cs="Times New Roman"/>
-          <w:sz w:val="24"/>
-          <w:szCs w:val="24"/>
-        </w:rPr>
-        <w:br/>
-        <w:t>}</w:t>
+          <w:sz w:val="28"/>
+          <w:szCs w:val="28"/>
+        </w:rPr>
+        <w:t xml:space="preserve">Annexe 1 </w:t>
+      </w:r>
+      <w:r>
+        <w:rPr>
+          <w:sz w:val="28"/>
+          <w:szCs w:val="28"/>
+        </w:rPr>
+        <w:t>–</w:t>
+      </w:r>
+      <w:r>
+        <w:rPr>
+          <w:sz w:val="28"/>
+          <w:szCs w:val="28"/>
+        </w:rPr>
+        <w:t xml:space="preserve"> </w:t>
+      </w:r>
+      <w:r>
+        <w:rPr>
+          <w:sz w:val="28"/>
+          <w:szCs w:val="28"/>
+        </w:rPr>
+        <w:t>Générer PAT (personnal Access Token)</w:t>
       </w:r>
     </w:p>
     <w:p/>
@@ -5344,19 +2498,33 @@
         <w:docPartUnique/>
       </w:docPartObj>
     </w:sdtPr>
+    <w:sdtEndPr/>
     <w:sdtContent>
       <w:p>
         <w:pPr>
           <w:pStyle w:val="Pieddepage"/>
         </w:pPr>
-        <w:fldSimple w:instr=" FILENAME  \* Lower  \* MERGEFORMAT ">
-          <w:r>
-            <w:rPr>
-              <w:noProof/>
-            </w:rPr>
-            <w:t>document3</w:t>
-          </w:r>
-        </w:fldSimple>
+        <w:r>
+          <w:fldChar w:fldCharType="begin"/>
+        </w:r>
+        <w:r>
+          <w:instrText xml:space="preserve"> FILENAME  \* Lower  \* MERGEFORMAT </w:instrText>
+        </w:r>
+        <w:r>
+          <w:fldChar w:fldCharType="separate"/>
+        </w:r>
+        <w:r>
+          <w:rPr>
+            <w:noProof/>
+          </w:rPr>
+          <w:t>document3</w:t>
+        </w:r>
+        <w:r>
+          <w:rPr>
+            <w:noProof/>
+          </w:rPr>
+          <w:fldChar w:fldCharType="end"/>
+        </w:r>
         <w:r>
           <w:t xml:space="preserve"> </w:t>
         </w:r>

</xml_diff>